<commit_message>
feat: unified RPD-OMD variable pool, dedup department, format OMD tests and enhance RPD AI pipeline
- Unified variables pool: auto-inherit all academic metadata, developers, reviewer, and protocol parameters from RPD into OMD
- Removed duplicate cathedra_name field; use single canonical department with auto-healing
- Added Word docx post-processing for test questions (question proposal + indented List Paragraph options + italic key)
- Enhanced curriculum parser with PyMuPDF competency matrix extraction (including PKdpo and program catalog)
- Added RPD AI content generator with real-time CLI streaming dump and expanded Pydantic schema
- Updated NiceGUI wizard steps (1-8), competency verification, and variables form grouping
</commit_message>
<xml_diff>
--- a/templates/OMD_template.docx
+++ b/templates/OMD_template.docx
@@ -695,46 +695,7 @@
         </w:rPr>
       </w:pPr>
       <w:r>
-        <w:rPr>
-          <w:sz w:val="28"/>
-          <w:szCs w:val="28"/>
-        </w:rPr>
-        <w:t>«</w:t>
-      </w:r>
-      <w:r>
-        <w:rPr>
-          <w:sz w:val="28"/>
-          <w:szCs w:val="28"/>
-        </w:rPr>
-        <w:t>____</w:t>
-      </w:r>
-      <w:r>
-        <w:rPr>
-          <w:sz w:val="28"/>
-          <w:szCs w:val="28"/>
-        </w:rPr>
-        <w:t xml:space="preserve">» </w:t>
-      </w:r>
-      <w:r>
-        <w:rPr>
-          <w:sz w:val="28"/>
-          <w:szCs w:val="28"/>
-        </w:rPr>
-        <w:t>__________20</w:t>
-      </w:r>
-      <w:r>
-        <w:rPr>
-          <w:sz w:val="28"/>
-          <w:szCs w:val="28"/>
-        </w:rPr>
-        <w:t>2</w:t>
-      </w:r>
-      <w:r>
-        <w:rPr>
-          <w:sz w:val="28"/>
-          <w:szCs w:val="28"/>
-        </w:rPr>
-        <w:t>__ г.</w:t>
+        <w:t>«{{ protocol_day|default("____") }}» {{ protocol_month|default("__________") }} {{ cathedra_meeting_year|default("202_") }} г.</w:t>
       </w:r>
     </w:p>
     <w:p>
@@ -1543,24 +1504,6 @@
     </w:p>
     <w:p>
       <w:pPr>
-        <w:rPr>
-          <w:sz w:val="28"/>
-          <w:szCs w:val="28"/>
-          <w:lang w:val="en-US"/>
-        </w:rPr>
-      </w:pPr>
-    </w:p>
-    <w:p>
-      <w:pPr>
-        <w:rPr>
-          <w:sz w:val="28"/>
-          <w:szCs w:val="28"/>
-          <w:lang w:val="en-US"/>
-        </w:rPr>
-      </w:pPr>
-    </w:p>
-    <w:p>
-      <w:pPr>
         <w:jc w:val="center"/>
         <w:rPr>
           <w:sz w:val="28"/>
@@ -1654,46 +1597,6 @@
         </w:rPr>
         <w:br w:type="page"/>
       </w:r>
-    </w:p>
-    <w:p>
-      <w:pPr>
-        <w:jc w:val="center"/>
-        <w:rPr>
-          <w:sz w:val="28"/>
-          <w:szCs w:val="28"/>
-          <w:lang w:val="en-US"/>
-        </w:rPr>
-      </w:pPr>
-    </w:p>
-    <w:p>
-      <w:pPr>
-        <w:jc w:val="center"/>
-        <w:rPr>
-          <w:sz w:val="28"/>
-          <w:szCs w:val="28"/>
-          <w:lang w:val="en-US"/>
-        </w:rPr>
-      </w:pPr>
-    </w:p>
-    <w:p>
-      <w:pPr>
-        <w:jc w:val="center"/>
-        <w:rPr>
-          <w:sz w:val="28"/>
-          <w:szCs w:val="28"/>
-          <w:lang w:val="en-US"/>
-        </w:rPr>
-      </w:pPr>
-    </w:p>
-    <w:p>
-      <w:pPr>
-        <w:jc w:val="center"/>
-        <w:rPr>
-          <w:sz w:val="28"/>
-          <w:szCs w:val="28"/>
-          <w:lang w:val="en-US"/>
-        </w:rPr>
-      </w:pPr>
     </w:p>
     <w:p>
       <w:pPr>
@@ -3557,26 +3460,6 @@
     </w:p>
     <w:p>
       <w:pPr>
-        <w:ind w:left="709" w:firstLine="709"/>
-        <w:jc w:val="both"/>
-        <w:rPr>
-          <w:i/>
-          <w:sz w:val="22"/>
-          <w:szCs w:val="22"/>
-        </w:rPr>
-      </w:pPr>
-      <w:r>
-        <w:rPr>
-          <w:i/>
-          <w:sz w:val="22"/>
-          <w:szCs w:val="22"/>
-          <w:highlight w:val="green"/>
-        </w:rPr>
-        <w:t>В контрольных заданиях прописать цифровые инструменты в соответствии с    таблицей 4 РПД</w:t>
-      </w:r>
-    </w:p>
-    <w:p>
-      <w:pPr>
         <w:rPr>
           <w:lang w:val="en-US"/>
         </w:rPr>
@@ -3651,33 +3534,11 @@
       </w:pPr>
       <w:r>
         <w:rPr>
-          <w:sz w:val="28"/>
-          <w:szCs w:val="24"/>
-        </w:rPr>
-        <w:t>Задание</w:t>
-      </w:r>
-      <w:r>
-        <w:rPr>
-          <w:sz w:val="28"/>
-          <w:szCs w:val="24"/>
-          <w:lang w:val="en-US"/>
-        </w:rPr>
-        <w:t>(</w:t>
-      </w:r>
-      <w:r>
-        <w:rPr>
-          <w:sz w:val="28"/>
-          <w:szCs w:val="24"/>
-        </w:rPr>
-        <w:t>я</w:t>
-      </w:r>
-      <w:r>
-        <w:rPr>
-          <w:sz w:val="28"/>
-          <w:szCs w:val="24"/>
-          <w:lang w:val="en-US"/>
-        </w:rPr>
-        <w:t>):</w:t>
+          <w:rFonts w:ascii="Times New Roman" w:hAnsi="Times New Roman"/>
+          <w:b/>
+          <w:sz w:val="24"/>
+        </w:rPr>
+        <w:t>{{ case_study_tasks_label }}:</w:t>
       </w:r>
     </w:p>
     <w:p>
@@ -3949,62 +3810,11 @@
       </w:pPr>
       <w:r>
         <w:rPr>
-          <w:b/>
-          <w:sz w:val="28"/>
-          <w:szCs w:val="28"/>
-        </w:rPr>
-        <w:t>Вопросы</w:t>
-      </w:r>
-      <w:r>
-        <w:rPr>
-          <w:b/>
-          <w:sz w:val="28"/>
-          <w:szCs w:val="28"/>
-          <w:lang w:val="en-US"/>
-        </w:rPr>
-        <w:t xml:space="preserve"> </w:t>
-      </w:r>
-      <w:r>
-        <w:rPr>
-          <w:b/>
-          <w:sz w:val="28"/>
-          <w:szCs w:val="28"/>
-        </w:rPr>
-        <w:t>для</w:t>
-      </w:r>
-      <w:r>
-        <w:rPr>
-          <w:b/>
-          <w:sz w:val="28"/>
-          <w:szCs w:val="28"/>
-          <w:lang w:val="en-US"/>
-        </w:rPr>
-        <w:t xml:space="preserve"> </w:t>
-      </w:r>
-      <w:r>
-        <w:rPr>
-          <w:b/>
-          <w:sz w:val="28"/>
-          <w:szCs w:val="28"/>
-        </w:rPr>
-        <w:t>коллоквиумов</w:t>
-      </w:r>
-      <w:r>
-        <w:rPr>
-          <w:b/>
-          <w:sz w:val="28"/>
-          <w:szCs w:val="28"/>
-          <w:lang w:val="en-US"/>
-        </w:rPr>
-        <w:t xml:space="preserve">, </w:t>
-      </w:r>
-      <w:r>
-        <w:rPr>
-          <w:b/>
-          <w:sz w:val="28"/>
-          <w:szCs w:val="28"/>
-        </w:rPr>
-        <w:t>собеседования</w:t>
+          <w:rFonts w:ascii="Times New Roman" w:hAnsi="Times New Roman"/>
+          <w:b/>
+          <w:sz w:val="24"/>
+        </w:rPr>
+        <w:t>{{ questions_section_title }}</w:t>
       </w:r>
     </w:p>
     <w:p>
@@ -5019,7 +4829,6 @@
           <w:sz w:val="28"/>
           <w:lang w:val="en-US"/>
         </w:rPr>
-        <w:t xml:space="preserve">- </w:t>
       </w:r>
       <w:proofErr w:type="gramStart"/>
       <w:r>
@@ -9278,1198 +9087,7 @@
     </w:p>
     <w:p>
       <w:pPr>
-        <w:widowControl w:val="0"/>
-        <w:jc w:val="center"/>
-        <w:rPr>
-          <w:b/>
-          <w:sz w:val="28"/>
-          <w:szCs w:val="28"/>
-        </w:rPr>
-      </w:pPr>
-      <w:r>
-        <w:rPr>
-          <w:b/>
-          <w:sz w:val="28"/>
-          <w:szCs w:val="28"/>
-        </w:rPr>
-        <w:lastRenderedPageBreak/>
-        <w:t>Лист актуализации оценочных материалов</w:t>
-      </w:r>
-      <w:r>
-        <w:rPr>
-          <w:b/>
-          <w:sz w:val="28"/>
-          <w:szCs w:val="28"/>
-        </w:rPr>
-        <w:t xml:space="preserve"> дисциплины</w:t>
-      </w:r>
-      <w:r>
-        <w:rPr>
-          <w:b/>
-          <w:sz w:val="28"/>
-          <w:szCs w:val="28"/>
-        </w:rPr>
-        <w:t xml:space="preserve"> </w:t>
-      </w:r>
-    </w:p>
-    <w:p>
-      <w:pPr>
-        <w:widowControl w:val="0"/>
-        <w:jc w:val="center"/>
-        <w:rPr>
-          <w:b/>
-          <w:sz w:val="28"/>
-          <w:szCs w:val="28"/>
-        </w:rPr>
-      </w:pPr>
-      <w:r>
-        <w:rPr>
-          <w:b/>
-          <w:sz w:val="28"/>
-          <w:szCs w:val="28"/>
-        </w:rPr>
-        <w:t>«{{ course_code }} {{ course_title }}»</w:t>
-      </w:r>
-    </w:p>
-    <w:p>
-      <w:pPr>
-        <w:jc w:val="center"/>
-        <w:rPr>
-          <w:sz w:val="28"/>
-          <w:szCs w:val="28"/>
-        </w:rPr>
-      </w:pPr>
-      <w:r>
-        <w:t xml:space="preserve">индекс по учебному плану, </w:t>
-      </w:r>
-      <w:r>
-        <w:t>наименование</w:t>
-      </w:r>
-      <w:r>
-        <w:rPr>
-          <w:sz w:val="28"/>
-          <w:szCs w:val="28"/>
-        </w:rPr>
-        <w:br/>
-      </w:r>
-    </w:p>
-    <w:p>
-      <w:pPr>
-        <w:rPr>
-          <w:sz w:val="26"/>
-          <w:szCs w:val="26"/>
-        </w:rPr>
-      </w:pPr>
-      <w:r>
-        <w:rPr>
-          <w:sz w:val="26"/>
-          <w:szCs w:val="26"/>
-        </w:rPr>
-        <w:t>для подготовки {{ degree_type }}</w:t>
-      </w:r>
-    </w:p>
-    <w:p>
-      <w:pPr>
-        <w:rPr>
-          <w:sz w:val="26"/>
-          <w:szCs w:val="26"/>
-        </w:rPr>
-      </w:pPr>
-      <w:proofErr w:type="gramStart"/>
-      <w:r>
-        <w:rPr>
-          <w:sz w:val="26"/>
-          <w:szCs w:val="26"/>
-        </w:rPr>
-        <w:t xml:space="preserve">{{ </w:t>
-      </w:r>
-      <w:r>
-        <w:rPr>
-          <w:sz w:val="26"/>
-          <w:szCs w:val="26"/>
-          <w:lang w:val="en-US"/>
-        </w:rPr>
-        <w:t>major</w:t>
-      </w:r>
-      <w:proofErr w:type="gramEnd"/>
-      <w:r>
-        <w:rPr>
-          <w:sz w:val="26"/>
-          <w:szCs w:val="26"/>
-        </w:rPr>
-        <w:t>_</w:t>
-      </w:r>
-      <w:r>
-        <w:rPr>
-          <w:sz w:val="26"/>
-          <w:szCs w:val="26"/>
-          <w:lang w:val="en-US"/>
-        </w:rPr>
-        <w:t>type</w:t>
-      </w:r>
-      <w:r>
-        <w:rPr>
-          <w:sz w:val="26"/>
-          <w:szCs w:val="26"/>
-        </w:rPr>
-        <w:t>_</w:t>
-      </w:r>
-      <w:proofErr w:type="gramStart"/>
-      <w:r>
-        <w:rPr>
-          <w:sz w:val="26"/>
-          <w:szCs w:val="26"/>
-          <w:lang w:val="en-US"/>
-        </w:rPr>
-        <w:t>label</w:t>
-      </w:r>
-      <w:r>
-        <w:rPr>
-          <w:sz w:val="26"/>
-          <w:szCs w:val="26"/>
-        </w:rPr>
-        <w:t xml:space="preserve"> }</w:t>
-      </w:r>
-      <w:proofErr w:type="gramEnd"/>
-      <w:r>
-        <w:rPr>
-          <w:sz w:val="26"/>
-          <w:szCs w:val="26"/>
-        </w:rPr>
-        <w:t xml:space="preserve">}: </w:t>
-      </w:r>
-      <w:proofErr w:type="gramStart"/>
-      <w:r>
-        <w:rPr>
-          <w:sz w:val="26"/>
-          <w:szCs w:val="26"/>
-        </w:rPr>
-        <w:t xml:space="preserve">{{ </w:t>
-      </w:r>
-      <w:r>
-        <w:rPr>
-          <w:sz w:val="26"/>
-          <w:szCs w:val="26"/>
-          <w:lang w:val="en-US"/>
-        </w:rPr>
-        <w:t>major</w:t>
-      </w:r>
-      <w:proofErr w:type="gramEnd"/>
-      <w:r>
-        <w:rPr>
-          <w:sz w:val="26"/>
-          <w:szCs w:val="26"/>
-        </w:rPr>
-        <w:t>_</w:t>
-      </w:r>
-      <w:proofErr w:type="gramStart"/>
-      <w:r>
-        <w:rPr>
-          <w:sz w:val="26"/>
-          <w:szCs w:val="26"/>
-          <w:lang w:val="en-US"/>
-        </w:rPr>
-        <w:t>code</w:t>
-      </w:r>
-      <w:r>
-        <w:rPr>
-          <w:sz w:val="26"/>
-          <w:szCs w:val="26"/>
-        </w:rPr>
-        <w:t xml:space="preserve"> }</w:t>
-      </w:r>
-      <w:proofErr w:type="gramEnd"/>
-      <w:r>
-        <w:rPr>
-          <w:sz w:val="26"/>
-          <w:szCs w:val="26"/>
-        </w:rPr>
-        <w:t xml:space="preserve">} — </w:t>
-      </w:r>
-      <w:proofErr w:type="gramStart"/>
-      <w:r>
-        <w:rPr>
-          <w:sz w:val="26"/>
-          <w:szCs w:val="26"/>
-        </w:rPr>
-        <w:t xml:space="preserve">{{ </w:t>
-      </w:r>
-      <w:r>
-        <w:rPr>
-          <w:sz w:val="26"/>
-          <w:szCs w:val="26"/>
-          <w:lang w:val="en-US"/>
-        </w:rPr>
-        <w:t>major</w:t>
-      </w:r>
-      <w:proofErr w:type="gramEnd"/>
-      <w:r>
-        <w:rPr>
-          <w:sz w:val="26"/>
-          <w:szCs w:val="26"/>
-        </w:rPr>
-        <w:t>_</w:t>
-      </w:r>
-      <w:proofErr w:type="gramStart"/>
-      <w:r>
-        <w:rPr>
-          <w:sz w:val="26"/>
-          <w:szCs w:val="26"/>
-          <w:lang w:val="en-US"/>
-        </w:rPr>
-        <w:t>title</w:t>
-      </w:r>
-      <w:r>
-        <w:rPr>
-          <w:sz w:val="26"/>
-          <w:szCs w:val="26"/>
-        </w:rPr>
-        <w:t xml:space="preserve"> }</w:t>
-      </w:r>
-      <w:proofErr w:type="gramEnd"/>
-      <w:r>
-        <w:rPr>
-          <w:sz w:val="26"/>
-          <w:szCs w:val="26"/>
-        </w:rPr>
-        <w:t>}</w:t>
-      </w:r>
-    </w:p>
-    <w:p>
-      <w:pPr>
-        <w:rPr>
-          <w:sz w:val="26"/>
-          <w:szCs w:val="26"/>
-          <w:lang w:val="en-US"/>
-        </w:rPr>
-      </w:pPr>
-      <w:proofErr w:type="gramStart"/>
-      <w:r>
-        <w:rPr>
-          <w:sz w:val="26"/>
-          <w:szCs w:val="26"/>
-          <w:lang w:val="en-US"/>
-        </w:rPr>
-        <w:t xml:space="preserve">{{ </w:t>
-      </w:r>
-      <w:proofErr w:type="spellStart"/>
-      <w:r>
-        <w:rPr>
-          <w:sz w:val="26"/>
-          <w:szCs w:val="26"/>
-          <w:lang w:val="en-US"/>
-        </w:rPr>
-        <w:t>profile</w:t>
-      </w:r>
-      <w:proofErr w:type="gramEnd"/>
-      <w:r>
-        <w:rPr>
-          <w:sz w:val="26"/>
-          <w:szCs w:val="26"/>
-          <w:lang w:val="en-US"/>
-        </w:rPr>
-        <w:t>_type_</w:t>
-      </w:r>
-      <w:proofErr w:type="gramStart"/>
-      <w:r>
-        <w:rPr>
-          <w:sz w:val="26"/>
-          <w:szCs w:val="26"/>
-          <w:lang w:val="en-US"/>
-        </w:rPr>
-        <w:t>label</w:t>
-      </w:r>
-      <w:proofErr w:type="spellEnd"/>
-      <w:r>
-        <w:rPr>
-          <w:sz w:val="26"/>
-          <w:szCs w:val="26"/>
-          <w:lang w:val="en-US"/>
-        </w:rPr>
-        <w:t xml:space="preserve"> }</w:t>
-      </w:r>
-      <w:proofErr w:type="gramEnd"/>
-      <w:r>
-        <w:rPr>
-          <w:sz w:val="26"/>
-          <w:szCs w:val="26"/>
-          <w:lang w:val="en-US"/>
-        </w:rPr>
-        <w:t xml:space="preserve">}: </w:t>
-      </w:r>
-      <w:proofErr w:type="gramStart"/>
-      <w:r>
-        <w:rPr>
-          <w:sz w:val="26"/>
-          <w:szCs w:val="26"/>
-          <w:lang w:val="en-US"/>
-        </w:rPr>
-        <w:t xml:space="preserve">{{ </w:t>
-      </w:r>
-      <w:proofErr w:type="spellStart"/>
-      <w:r>
-        <w:rPr>
-          <w:sz w:val="26"/>
-          <w:szCs w:val="26"/>
-          <w:lang w:val="en-US"/>
-        </w:rPr>
-        <w:t>profile</w:t>
-      </w:r>
-      <w:proofErr w:type="gramEnd"/>
-      <w:r>
-        <w:rPr>
-          <w:sz w:val="26"/>
-          <w:szCs w:val="26"/>
-          <w:lang w:val="en-US"/>
-        </w:rPr>
-        <w:t>_</w:t>
-      </w:r>
-      <w:proofErr w:type="gramStart"/>
-      <w:r>
-        <w:rPr>
-          <w:sz w:val="26"/>
-          <w:szCs w:val="26"/>
-          <w:lang w:val="en-US"/>
-        </w:rPr>
-        <w:t>title</w:t>
-      </w:r>
-      <w:proofErr w:type="spellEnd"/>
-      <w:r>
-        <w:rPr>
-          <w:sz w:val="26"/>
-          <w:szCs w:val="26"/>
-          <w:lang w:val="en-US"/>
-        </w:rPr>
-        <w:t xml:space="preserve"> }</w:t>
-      </w:r>
-      <w:proofErr w:type="gramEnd"/>
-      <w:r>
-        <w:rPr>
-          <w:sz w:val="26"/>
-          <w:szCs w:val="26"/>
-          <w:lang w:val="en-US"/>
-        </w:rPr>
-        <w:t>}</w:t>
-      </w:r>
-    </w:p>
-    <w:p>
-      <w:pPr>
-        <w:rPr>
-          <w:sz w:val="26"/>
-          <w:szCs w:val="26"/>
-          <w:lang w:val="en-US"/>
-        </w:rPr>
-      </w:pPr>
-      <w:r>
-        <w:rPr>
-          <w:sz w:val="26"/>
-          <w:szCs w:val="26"/>
-        </w:rPr>
-        <w:t>Форма</w:t>
-      </w:r>
-      <w:r>
-        <w:rPr>
-          <w:sz w:val="26"/>
-          <w:szCs w:val="26"/>
-          <w:lang w:val="en-US"/>
-        </w:rPr>
-        <w:t xml:space="preserve"> </w:t>
-      </w:r>
-      <w:r>
-        <w:rPr>
-          <w:sz w:val="26"/>
-          <w:szCs w:val="26"/>
-        </w:rPr>
-        <w:t>обучения</w:t>
-      </w:r>
-      <w:r>
-        <w:rPr>
-          <w:sz w:val="26"/>
-          <w:szCs w:val="26"/>
-          <w:lang w:val="en-US"/>
-        </w:rPr>
-        <w:t xml:space="preserve">: </w:t>
-      </w:r>
-      <w:proofErr w:type="gramStart"/>
-      <w:r>
-        <w:rPr>
-          <w:sz w:val="26"/>
-          <w:szCs w:val="26"/>
-          <w:lang w:val="en-US"/>
-        </w:rPr>
-        <w:t xml:space="preserve">{{ </w:t>
-      </w:r>
-      <w:proofErr w:type="spellStart"/>
-      <w:r>
-        <w:rPr>
-          <w:sz w:val="26"/>
-          <w:szCs w:val="26"/>
-          <w:lang w:val="en-US"/>
-        </w:rPr>
-        <w:t>study</w:t>
-      </w:r>
-      <w:proofErr w:type="gramEnd"/>
-      <w:r>
-        <w:rPr>
-          <w:sz w:val="26"/>
-          <w:szCs w:val="26"/>
-          <w:lang w:val="en-US"/>
-        </w:rPr>
-        <w:t>_</w:t>
-      </w:r>
-      <w:proofErr w:type="gramStart"/>
-      <w:r>
-        <w:rPr>
-          <w:sz w:val="26"/>
-          <w:szCs w:val="26"/>
-          <w:lang w:val="en-US"/>
-        </w:rPr>
-        <w:t>form</w:t>
-      </w:r>
-      <w:proofErr w:type="spellEnd"/>
-      <w:r>
-        <w:rPr>
-          <w:sz w:val="26"/>
-          <w:szCs w:val="26"/>
-          <w:lang w:val="en-US"/>
-        </w:rPr>
-        <w:t xml:space="preserve"> }</w:t>
-      </w:r>
-      <w:proofErr w:type="gramEnd"/>
-      <w:r>
-        <w:rPr>
-          <w:sz w:val="26"/>
-          <w:szCs w:val="26"/>
-          <w:lang w:val="en-US"/>
-        </w:rPr>
-        <w:t>}</w:t>
-      </w:r>
-    </w:p>
-    <w:p>
-      <w:pPr>
-        <w:rPr>
-          <w:sz w:val="26"/>
-          <w:szCs w:val="26"/>
-          <w:lang w:val="en-US"/>
-        </w:rPr>
-      </w:pPr>
-      <w:r>
-        <w:rPr>
-          <w:sz w:val="26"/>
-          <w:szCs w:val="26"/>
-        </w:rPr>
-        <w:t>Год</w:t>
-      </w:r>
-      <w:r>
-        <w:rPr>
-          <w:sz w:val="26"/>
-          <w:szCs w:val="26"/>
-          <w:lang w:val="en-US"/>
-        </w:rPr>
-        <w:t xml:space="preserve"> </w:t>
-      </w:r>
-      <w:r>
-        <w:rPr>
-          <w:sz w:val="26"/>
-          <w:szCs w:val="26"/>
-        </w:rPr>
-        <w:t>начала</w:t>
-      </w:r>
-      <w:r>
-        <w:rPr>
-          <w:sz w:val="26"/>
-          <w:szCs w:val="26"/>
-          <w:lang w:val="en-US"/>
-        </w:rPr>
-        <w:t xml:space="preserve"> </w:t>
-      </w:r>
-      <w:r>
-        <w:rPr>
-          <w:sz w:val="26"/>
-          <w:szCs w:val="26"/>
-        </w:rPr>
-        <w:t>подготовки</w:t>
-      </w:r>
-      <w:r>
-        <w:rPr>
-          <w:sz w:val="26"/>
-          <w:szCs w:val="26"/>
-          <w:lang w:val="en-US"/>
-        </w:rPr>
-        <w:t xml:space="preserve">: </w:t>
-      </w:r>
-      <w:proofErr w:type="gramStart"/>
-      <w:r>
-        <w:rPr>
-          <w:sz w:val="26"/>
-          <w:szCs w:val="26"/>
-          <w:lang w:val="en-US"/>
-        </w:rPr>
-        <w:t xml:space="preserve">{{ </w:t>
-      </w:r>
-      <w:proofErr w:type="spellStart"/>
-      <w:r>
-        <w:rPr>
-          <w:sz w:val="26"/>
-          <w:szCs w:val="26"/>
-          <w:lang w:val="en-US"/>
-        </w:rPr>
-        <w:t>year</w:t>
-      </w:r>
-      <w:proofErr w:type="gramEnd"/>
-      <w:r>
-        <w:rPr>
-          <w:sz w:val="26"/>
-          <w:szCs w:val="26"/>
-          <w:lang w:val="en-US"/>
-        </w:rPr>
-        <w:t>_of_study_</w:t>
-      </w:r>
-      <w:proofErr w:type="gramStart"/>
-      <w:r>
-        <w:rPr>
-          <w:sz w:val="26"/>
-          <w:szCs w:val="26"/>
-          <w:lang w:val="en-US"/>
-        </w:rPr>
-        <w:t>start</w:t>
-      </w:r>
-      <w:proofErr w:type="spellEnd"/>
-      <w:r>
-        <w:rPr>
-          <w:sz w:val="26"/>
-          <w:szCs w:val="26"/>
-          <w:lang w:val="en-US"/>
-        </w:rPr>
-        <w:t xml:space="preserve"> }</w:t>
-      </w:r>
-      <w:proofErr w:type="gramEnd"/>
-      <w:r>
-        <w:rPr>
-          <w:sz w:val="26"/>
-          <w:szCs w:val="26"/>
-          <w:lang w:val="en-US"/>
-        </w:rPr>
-        <w:t>}</w:t>
-      </w:r>
-    </w:p>
-    <w:p>
-      <w:pPr>
-        <w:spacing w:before="120"/>
-        <w:jc w:val="both"/>
-        <w:rPr>
-          <w:sz w:val="26"/>
-          <w:szCs w:val="26"/>
-          <w:lang w:val="en-US"/>
-        </w:rPr>
-      </w:pPr>
-      <w:r>
-        <w:rPr>
-          <w:sz w:val="26"/>
-          <w:szCs w:val="26"/>
-        </w:rPr>
-        <w:t>Курс</w:t>
-      </w:r>
-      <w:r>
-        <w:rPr>
-          <w:sz w:val="26"/>
-          <w:szCs w:val="26"/>
-          <w:lang w:val="en-US"/>
-        </w:rPr>
-        <w:t xml:space="preserve"> </w:t>
-      </w:r>
-      <w:proofErr w:type="gramStart"/>
-      <w:r>
-        <w:rPr>
-          <w:sz w:val="26"/>
-          <w:szCs w:val="26"/>
-          <w:lang w:val="en-US"/>
-        </w:rPr>
-        <w:t xml:space="preserve">{{ </w:t>
-      </w:r>
-      <w:proofErr w:type="spellStart"/>
-      <w:r>
-        <w:rPr>
-          <w:sz w:val="26"/>
-          <w:szCs w:val="26"/>
-          <w:lang w:val="en-US"/>
-        </w:rPr>
-        <w:t>course</w:t>
-      </w:r>
-      <w:proofErr w:type="gramEnd"/>
-      <w:r>
-        <w:rPr>
-          <w:sz w:val="26"/>
-          <w:szCs w:val="26"/>
-          <w:lang w:val="en-US"/>
-        </w:rPr>
-        <w:t>_</w:t>
-      </w:r>
-      <w:proofErr w:type="gramStart"/>
-      <w:r>
-        <w:rPr>
-          <w:sz w:val="26"/>
-          <w:szCs w:val="26"/>
-          <w:lang w:val="en-US"/>
-        </w:rPr>
-        <w:t>year</w:t>
-      </w:r>
-      <w:proofErr w:type="spellEnd"/>
-      <w:r>
-        <w:rPr>
-          <w:sz w:val="26"/>
-          <w:szCs w:val="26"/>
-          <w:lang w:val="en-US"/>
-        </w:rPr>
-        <w:t xml:space="preserve"> }</w:t>
-      </w:r>
-      <w:proofErr w:type="gramEnd"/>
-      <w:r>
-        <w:rPr>
-          <w:sz w:val="26"/>
-          <w:szCs w:val="26"/>
-          <w:lang w:val="en-US"/>
-        </w:rPr>
-        <w:t>}</w:t>
-      </w:r>
-    </w:p>
-    <w:p>
-      <w:pPr>
-        <w:rPr>
-          <w:sz w:val="26"/>
-          <w:szCs w:val="26"/>
-          <w:lang w:val="en-US"/>
-        </w:rPr>
-      </w:pPr>
-      <w:r>
-        <w:rPr>
-          <w:sz w:val="26"/>
-          <w:szCs w:val="26"/>
-        </w:rPr>
-        <w:t>Семестр</w:t>
-      </w:r>
-      <w:r>
-        <w:rPr>
-          <w:sz w:val="26"/>
-          <w:szCs w:val="26"/>
-          <w:lang w:val="en-US"/>
-        </w:rPr>
-        <w:t xml:space="preserve"> </w:t>
-      </w:r>
-      <w:proofErr w:type="gramStart"/>
-      <w:r>
-        <w:rPr>
-          <w:sz w:val="26"/>
-          <w:szCs w:val="26"/>
-          <w:lang w:val="en-US"/>
-        </w:rPr>
-        <w:t>{{ semester</w:t>
-      </w:r>
-      <w:proofErr w:type="gramEnd"/>
-      <w:r>
-        <w:rPr>
-          <w:sz w:val="26"/>
-          <w:szCs w:val="26"/>
-          <w:lang w:val="en-US"/>
-        </w:rPr>
-        <w:t xml:space="preserve"> }}</w:t>
-      </w:r>
-    </w:p>
-    <w:p>
-      <w:pPr>
-        <w:widowControl w:val="0"/>
-        <w:rPr>
-          <w:sz w:val="26"/>
-          <w:szCs w:val="26"/>
-        </w:rPr>
-      </w:pPr>
-      <w:r>
-        <w:rPr>
-          <w:sz w:val="26"/>
-          <w:szCs w:val="26"/>
-        </w:rPr>
-        <w:t xml:space="preserve">а) В ОМД </w:t>
-      </w:r>
-      <w:r>
-        <w:rPr>
-          <w:sz w:val="26"/>
-          <w:szCs w:val="26"/>
-        </w:rPr>
-        <w:t>не вносятся</w:t>
-      </w:r>
-      <w:r>
-        <w:rPr>
-          <w:sz w:val="26"/>
-          <w:szCs w:val="26"/>
-        </w:rPr>
-        <w:t xml:space="preserve"> изменения. Оценочные </w:t>
-      </w:r>
-      <w:proofErr w:type="gramStart"/>
-      <w:r>
-        <w:rPr>
-          <w:sz w:val="26"/>
-          <w:szCs w:val="26"/>
-        </w:rPr>
-        <w:t>материалы  актуализированы</w:t>
-      </w:r>
-      <w:proofErr w:type="gramEnd"/>
-    </w:p>
-    <w:p>
-      <w:pPr>
-        <w:widowControl w:val="0"/>
-        <w:rPr>
-          <w:sz w:val="26"/>
-          <w:szCs w:val="26"/>
-        </w:rPr>
-      </w:pPr>
-      <w:r>
-        <w:rPr>
-          <w:sz w:val="26"/>
-          <w:szCs w:val="26"/>
-        </w:rPr>
-        <w:t xml:space="preserve">  для 20__ г. начала подготовки.</w:t>
-      </w:r>
-    </w:p>
-    <w:p>
-      <w:pPr>
-        <w:widowControl w:val="0"/>
-        <w:rPr>
-          <w:sz w:val="26"/>
-          <w:szCs w:val="26"/>
-        </w:rPr>
-      </w:pPr>
-      <w:r>
-        <w:rPr>
-          <w:sz w:val="26"/>
-          <w:szCs w:val="26"/>
-        </w:rPr>
-        <w:t xml:space="preserve">б) </w:t>
-      </w:r>
-      <w:r>
-        <w:rPr>
-          <w:sz w:val="26"/>
-          <w:szCs w:val="26"/>
-        </w:rPr>
-        <w:t xml:space="preserve">В </w:t>
-      </w:r>
-      <w:r>
-        <w:rPr>
-          <w:sz w:val="26"/>
-          <w:szCs w:val="26"/>
-        </w:rPr>
-        <w:t>ОМД</w:t>
-      </w:r>
-      <w:r>
-        <w:rPr>
-          <w:sz w:val="26"/>
-          <w:szCs w:val="26"/>
-        </w:rPr>
-        <w:t xml:space="preserve"> вносятся следующие изменения (указать на какой год начала подготовки):</w:t>
-      </w:r>
-    </w:p>
-    <w:p>
-      <w:pPr>
-        <w:widowControl w:val="0"/>
-        <w:numPr>
-          <w:ilvl w:val="0"/>
-          <w:numId w:val="1"/>
-        </w:numPr>
-        <w:rPr>
-          <w:sz w:val="26"/>
-          <w:szCs w:val="26"/>
-        </w:rPr>
-      </w:pPr>
-      <w:r>
-        <w:rPr>
-          <w:sz w:val="26"/>
-          <w:szCs w:val="26"/>
-        </w:rPr>
-        <w:t>…………………………………..;</w:t>
-      </w:r>
-    </w:p>
-    <w:p>
-      <w:pPr>
-        <w:widowControl w:val="0"/>
-        <w:numPr>
-          <w:ilvl w:val="0"/>
-          <w:numId w:val="1"/>
-        </w:numPr>
-        <w:rPr>
-          <w:sz w:val="26"/>
-          <w:szCs w:val="26"/>
-        </w:rPr>
-      </w:pPr>
-      <w:r>
-        <w:rPr>
-          <w:sz w:val="26"/>
-          <w:szCs w:val="26"/>
-        </w:rPr>
-        <w:t>…………………………………..;</w:t>
-      </w:r>
-    </w:p>
-    <w:p>
-      <w:pPr>
-        <w:widowControl w:val="0"/>
-        <w:numPr>
-          <w:ilvl w:val="0"/>
-          <w:numId w:val="1"/>
-        </w:numPr>
-        <w:rPr>
-          <w:sz w:val="26"/>
-          <w:szCs w:val="26"/>
-        </w:rPr>
-      </w:pPr>
-      <w:r>
-        <w:rPr>
-          <w:sz w:val="26"/>
-          <w:szCs w:val="26"/>
-        </w:rPr>
-        <w:t>……………………………………</w:t>
-      </w:r>
-    </w:p>
-    <w:p>
-      <w:pPr>
-        <w:ind w:right="-240"/>
-        <w:jc w:val="both"/>
-        <w:rPr>
-          <w:sz w:val="26"/>
-          <w:szCs w:val="26"/>
-        </w:rPr>
-      </w:pPr>
-      <w:r>
-        <w:rPr>
-          <w:sz w:val="26"/>
-          <w:szCs w:val="26"/>
-        </w:rPr>
-        <w:t>Разработчик</w:t>
-      </w:r>
-      <w:r>
-        <w:rPr>
-          <w:sz w:val="26"/>
-          <w:szCs w:val="26"/>
-        </w:rPr>
-        <w:t xml:space="preserve"> (и): ______________________________________________________</w:t>
-      </w:r>
-    </w:p>
-    <w:p>
-      <w:pPr>
-        <w:ind w:left="1416" w:firstLine="708"/>
-        <w:jc w:val="both"/>
-        <w:rPr>
-          <w:sz w:val="26"/>
-          <w:szCs w:val="26"/>
-        </w:rPr>
-      </w:pPr>
-      <w:r>
-        <w:rPr>
-          <w:sz w:val="26"/>
-          <w:szCs w:val="26"/>
-          <w:vertAlign w:val="superscript"/>
-        </w:rPr>
-        <w:t>(ФИО, ученая степень, ученое звание)</w:t>
-      </w:r>
-      <w:r>
-        <w:rPr>
-          <w:sz w:val="26"/>
-          <w:szCs w:val="26"/>
-        </w:rPr>
-        <w:tab/>
-      </w:r>
-      <w:r>
-        <w:rPr>
-          <w:sz w:val="26"/>
-          <w:szCs w:val="26"/>
-        </w:rPr>
-        <w:tab/>
-      </w:r>
-      <w:r>
-        <w:rPr>
-          <w:sz w:val="26"/>
-          <w:szCs w:val="26"/>
-        </w:rPr>
-        <w:tab/>
-      </w:r>
-      <w:r>
-        <w:rPr>
-          <w:sz w:val="26"/>
-          <w:szCs w:val="26"/>
-        </w:rPr>
-        <w:tab/>
-        <w:t xml:space="preserve"> «__» ________ 20</w:t>
-      </w:r>
-      <w:r>
-        <w:rPr>
-          <w:sz w:val="26"/>
-          <w:szCs w:val="26"/>
-        </w:rPr>
-        <w:t>2</w:t>
-      </w:r>
-      <w:r>
-        <w:rPr>
-          <w:sz w:val="26"/>
-          <w:szCs w:val="26"/>
-        </w:rPr>
-        <w:t>_г.</w:t>
-      </w:r>
-    </w:p>
-    <w:p>
-      <w:pPr>
-        <w:widowControl w:val="0"/>
-        <w:rPr>
-          <w:sz w:val="26"/>
-          <w:szCs w:val="26"/>
-        </w:rPr>
-      </w:pPr>
-    </w:p>
-    <w:p>
-      <w:pPr>
-        <w:widowControl w:val="0"/>
-        <w:rPr>
-          <w:sz w:val="26"/>
-          <w:szCs w:val="26"/>
-        </w:rPr>
-      </w:pPr>
-      <w:r>
-        <w:rPr>
-          <w:sz w:val="26"/>
-          <w:szCs w:val="26"/>
-        </w:rPr>
-        <w:t xml:space="preserve">ОМД пересмотрены и </w:t>
-      </w:r>
-      <w:proofErr w:type="gramStart"/>
-      <w:r>
-        <w:rPr>
-          <w:sz w:val="26"/>
-          <w:szCs w:val="26"/>
-        </w:rPr>
-        <w:t>одобрены  на</w:t>
-      </w:r>
-      <w:proofErr w:type="gramEnd"/>
-      <w:r>
-        <w:rPr>
-          <w:sz w:val="26"/>
-          <w:szCs w:val="26"/>
-        </w:rPr>
-        <w:t xml:space="preserve"> заседании </w:t>
-      </w:r>
-      <w:proofErr w:type="gramStart"/>
-      <w:r>
-        <w:rPr>
-          <w:sz w:val="26"/>
-          <w:szCs w:val="26"/>
-        </w:rPr>
-        <w:t>кафедры  {</w:t>
-      </w:r>
-      <w:proofErr w:type="gramEnd"/>
-      <w:r>
-        <w:rPr>
-          <w:sz w:val="26"/>
-          <w:szCs w:val="26"/>
-        </w:rPr>
-        <w:t xml:space="preserve">% if 'кафедра' in </w:t>
-      </w:r>
-      <w:proofErr w:type="gramStart"/>
-      <w:r>
-        <w:rPr>
-          <w:sz w:val="26"/>
-          <w:szCs w:val="26"/>
-        </w:rPr>
-        <w:t>department.lower</w:t>
-      </w:r>
-      <w:proofErr w:type="gramEnd"/>
-      <w:r>
-        <w:rPr>
-          <w:sz w:val="26"/>
-          <w:szCs w:val="26"/>
-        </w:rPr>
-        <w:t xml:space="preserve">() </w:t>
-      </w:r>
-      <w:proofErr w:type="gramStart"/>
-      <w:r>
-        <w:rPr>
-          <w:sz w:val="26"/>
-          <w:szCs w:val="26"/>
-        </w:rPr>
-        <w:t>%}{{ department</w:t>
-      </w:r>
-      <w:proofErr w:type="gramEnd"/>
-      <w:r>
-        <w:rPr>
-          <w:sz w:val="26"/>
-          <w:szCs w:val="26"/>
-        </w:rPr>
-        <w:t xml:space="preserve"> | </w:t>
-      </w:r>
-      <w:proofErr w:type="gramStart"/>
-      <w:r>
-        <w:rPr>
-          <w:sz w:val="26"/>
-          <w:szCs w:val="26"/>
-        </w:rPr>
-        <w:t>replace(</w:t>
-      </w:r>
-      <w:proofErr w:type="gramEnd"/>
-      <w:r>
-        <w:rPr>
-          <w:sz w:val="26"/>
-          <w:szCs w:val="26"/>
-        </w:rPr>
-        <w:t xml:space="preserve">'Кафедра ', '') | </w:t>
-      </w:r>
-      <w:proofErr w:type="gramStart"/>
-      <w:r>
-        <w:rPr>
-          <w:sz w:val="26"/>
-          <w:szCs w:val="26"/>
-        </w:rPr>
-        <w:t>replace(</w:t>
-      </w:r>
-      <w:proofErr w:type="gramEnd"/>
-      <w:r>
-        <w:rPr>
-          <w:sz w:val="26"/>
-          <w:szCs w:val="26"/>
-        </w:rPr>
-        <w:t>'кафедра ', ''</w:t>
-      </w:r>
-      <w:proofErr w:type="gramStart"/>
-      <w:r>
-        <w:rPr>
-          <w:sz w:val="26"/>
-          <w:szCs w:val="26"/>
-        </w:rPr>
-        <w:t>) }}{</w:t>
-      </w:r>
-      <w:proofErr w:type="gramEnd"/>
-      <w:r>
-        <w:rPr>
-          <w:sz w:val="26"/>
-          <w:szCs w:val="26"/>
-        </w:rPr>
-        <w:t xml:space="preserve">% else </w:t>
-      </w:r>
-      <w:proofErr w:type="gramStart"/>
-      <w:r>
-        <w:rPr>
-          <w:sz w:val="26"/>
-          <w:szCs w:val="26"/>
-        </w:rPr>
-        <w:t>%}{{ department</w:t>
-      </w:r>
-      <w:proofErr w:type="gramEnd"/>
-      <w:r>
-        <w:rPr>
-          <w:sz w:val="26"/>
-          <w:szCs w:val="26"/>
-        </w:rPr>
-        <w:t xml:space="preserve"> </w:t>
-      </w:r>
-      <w:proofErr w:type="gramStart"/>
-      <w:r>
-        <w:rPr>
-          <w:sz w:val="26"/>
-          <w:szCs w:val="26"/>
-        </w:rPr>
-        <w:t>}}{</w:t>
-      </w:r>
-      <w:proofErr w:type="gramEnd"/>
-      <w:r>
-        <w:rPr>
-          <w:sz w:val="26"/>
-          <w:szCs w:val="26"/>
-        </w:rPr>
-        <w:t>% endif %}</w:t>
-      </w:r>
-    </w:p>
-    <w:p>
-      <w:pPr>
-        <w:widowControl w:val="0"/>
-        <w:rPr>
-          <w:sz w:val="26"/>
-          <w:szCs w:val="26"/>
-        </w:rPr>
-      </w:pPr>
-      <w:r>
-        <w:rPr>
-          <w:sz w:val="26"/>
-          <w:szCs w:val="26"/>
-        </w:rPr>
-        <w:t>_____</w:t>
-      </w:r>
-      <w:r>
-        <w:rPr>
-          <w:sz w:val="26"/>
-          <w:szCs w:val="26"/>
-        </w:rPr>
-        <w:t>_________________________</w:t>
-      </w:r>
-      <w:r>
-        <w:rPr>
-          <w:sz w:val="26"/>
-          <w:szCs w:val="26"/>
-        </w:rPr>
-        <w:t xml:space="preserve"> протокол № ______</w:t>
-      </w:r>
-      <w:r>
-        <w:rPr>
-          <w:sz w:val="26"/>
-          <w:szCs w:val="26"/>
-        </w:rPr>
-        <w:t xml:space="preserve"> от </w:t>
-      </w:r>
-      <w:r>
-        <w:rPr>
-          <w:sz w:val="26"/>
-          <w:szCs w:val="26"/>
-        </w:rPr>
-        <w:t>«__» ______</w:t>
-      </w:r>
-      <w:r>
-        <w:rPr>
-          <w:sz w:val="26"/>
-          <w:szCs w:val="26"/>
-        </w:rPr>
-        <w:t>_______</w:t>
-      </w:r>
-      <w:r>
-        <w:rPr>
-          <w:sz w:val="26"/>
-          <w:szCs w:val="26"/>
-        </w:rPr>
-        <w:t>20</w:t>
-      </w:r>
-      <w:r>
-        <w:rPr>
-          <w:sz w:val="26"/>
-          <w:szCs w:val="26"/>
-        </w:rPr>
-        <w:t>2</w:t>
-      </w:r>
-      <w:r>
-        <w:rPr>
-          <w:sz w:val="26"/>
-          <w:szCs w:val="26"/>
-        </w:rPr>
-        <w:t xml:space="preserve">__г.   </w:t>
-      </w:r>
-    </w:p>
-    <w:p>
-      <w:pPr>
-        <w:rPr>
-          <w:sz w:val="26"/>
-          <w:szCs w:val="26"/>
-        </w:rPr>
-      </w:pPr>
-      <w:r>
-        <w:rPr>
-          <w:sz w:val="26"/>
-          <w:szCs w:val="26"/>
-        </w:rPr>
-        <w:br w:type="page"/>
-      </w:r>
-    </w:p>
-    <w:p>
-      <w:pPr>
+        <w:pageBreakBefore/>
         <w:shd w:val="clear" w:color="auto" w:fill="FFFFFF"/>
         <w:jc w:val="center"/>
         <w:rPr>
@@ -10480,11 +9098,7 @@
           <w:szCs w:val="24"/>
         </w:rPr>
       </w:pPr>
-    </w:p>
-    <w:p>
-      <w:pPr>
-        <w:shd w:val="clear" w:color="auto" w:fill="FFFFFF"/>
-        <w:jc w:val="center"/>
+      <w:r>
         <w:rPr>
           <w:b/>
           <w:bCs/>
@@ -10492,8 +9106,12 @@
           <w:sz w:val="24"/>
           <w:szCs w:val="24"/>
         </w:rPr>
-      </w:pPr>
-      <w:r>
+        <w:t>РЕЦЕНЗИЯ</w:t>
+      </w:r>
+    </w:p>
+    <w:p>
+      <w:pPr>
+        <w:jc w:val="center"/>
         <w:rPr>
           <w:b/>
           <w:bCs/>
@@ -10501,12 +9119,8 @@
           <w:sz w:val="24"/>
           <w:szCs w:val="24"/>
         </w:rPr>
-        <w:t>РЕЦЕНЗИЯ</w:t>
-      </w:r>
-    </w:p>
-    <w:p>
-      <w:pPr>
-        <w:jc w:val="center"/>
+      </w:pPr>
+      <w:r>
         <w:rPr>
           <w:b/>
           <w:bCs/>
@@ -10514,7 +9128,8 @@
           <w:sz w:val="24"/>
           <w:szCs w:val="24"/>
         </w:rPr>
-      </w:pPr>
+        <w:t xml:space="preserve">на оценочные </w:t>
+      </w:r>
       <w:r>
         <w:rPr>
           <w:b/>
@@ -10523,7 +9138,7 @@
           <w:sz w:val="24"/>
           <w:szCs w:val="24"/>
         </w:rPr>
-        <w:t xml:space="preserve">на оценочные </w:t>
+        <w:t>материалы</w:t>
       </w:r>
       <w:r>
         <w:rPr>
@@ -10533,16 +9148,6 @@
           <w:sz w:val="24"/>
           <w:szCs w:val="24"/>
         </w:rPr>
-        <w:t>материалы</w:t>
-      </w:r>
-      <w:r>
-        <w:rPr>
-          <w:b/>
-          <w:bCs/>
-          <w:spacing w:val="-6"/>
-          <w:sz w:val="24"/>
-          <w:szCs w:val="24"/>
-        </w:rPr>
         <w:t xml:space="preserve"> дисциплины</w:t>
       </w:r>
     </w:p>
@@ -10643,1400 +9248,261 @@
     </w:p>
     <w:p>
       <w:pPr>
-        <w:jc w:val="center"/>
-        <w:rPr>
-          <w:b/>
-          <w:bCs/>
-          <w:color w:val="0000FF"/>
-          <w:sz w:val="24"/>
-          <w:szCs w:val="24"/>
-          <w:lang w:val="en-US"/>
-        </w:rPr>
-      </w:pPr>
-    </w:p>
-    <w:p>
-      <w:pPr>
-        <w:ind w:firstLine="709"/>
+        <w:spacing w:after="120"/>
+      </w:pPr>
+    </w:p>
+    <w:p>
+      <w:pPr>
+        <w:spacing w:line="276" w:lineRule="auto" w:after="120"/>
+        <w:ind w:firstLine="708"/>
         <w:jc w:val="both"/>
-        <w:rPr>
-          <w:b/>
-          <w:sz w:val="24"/>
-          <w:szCs w:val="24"/>
-          <w:lang w:val="en-US"/>
-        </w:rPr>
-      </w:pPr>
-      <w:r>
-        <w:rPr>
-          <w:b/>
-          <w:color w:val="0000FF"/>
-          <w:sz w:val="24"/>
-          <w:szCs w:val="24"/>
-        </w:rPr>
-        <w:t>для</w:t>
-      </w:r>
-      <w:r>
-        <w:rPr>
-          <w:b/>
-          <w:color w:val="0000FF"/>
-          <w:sz w:val="24"/>
-          <w:szCs w:val="24"/>
-          <w:lang w:val="en-US"/>
-        </w:rPr>
-        <w:t xml:space="preserve"> </w:t>
-      </w:r>
-      <w:r>
-        <w:rPr>
-          <w:b/>
-          <w:color w:val="0000FF"/>
-          <w:sz w:val="24"/>
-          <w:szCs w:val="24"/>
-        </w:rPr>
-        <w:t>подготовки</w:t>
-      </w:r>
-      <w:r>
-        <w:rPr>
-          <w:b/>
-          <w:color w:val="0000FF"/>
-          <w:sz w:val="24"/>
-          <w:szCs w:val="24"/>
-          <w:lang w:val="en-US"/>
-        </w:rPr>
-        <w:t xml:space="preserve"> </w:t>
-      </w:r>
-      <w:proofErr w:type="gramStart"/>
-      <w:r>
-        <w:rPr>
-          <w:b/>
-          <w:color w:val="0000FF"/>
-          <w:sz w:val="24"/>
-          <w:szCs w:val="24"/>
-          <w:lang w:val="en-US"/>
-        </w:rPr>
-        <w:t xml:space="preserve">{{ </w:t>
-      </w:r>
-      <w:proofErr w:type="spellStart"/>
-      <w:r>
-        <w:rPr>
-          <w:b/>
-          <w:color w:val="0000FF"/>
-          <w:sz w:val="24"/>
-          <w:szCs w:val="24"/>
-          <w:lang w:val="en-US"/>
-        </w:rPr>
-        <w:t>degree</w:t>
-      </w:r>
-      <w:proofErr w:type="gramEnd"/>
-      <w:r>
-        <w:rPr>
-          <w:b/>
-          <w:color w:val="0000FF"/>
-          <w:sz w:val="24"/>
-          <w:szCs w:val="24"/>
-          <w:lang w:val="en-US"/>
-        </w:rPr>
-        <w:t>_</w:t>
-      </w:r>
-      <w:proofErr w:type="gramStart"/>
-      <w:r>
-        <w:rPr>
-          <w:b/>
-          <w:color w:val="0000FF"/>
-          <w:sz w:val="24"/>
-          <w:szCs w:val="24"/>
-          <w:lang w:val="en-US"/>
-        </w:rPr>
-        <w:t>type</w:t>
-      </w:r>
-      <w:proofErr w:type="spellEnd"/>
-      <w:r>
-        <w:rPr>
-          <w:b/>
-          <w:color w:val="0000FF"/>
-          <w:sz w:val="24"/>
-          <w:szCs w:val="24"/>
-          <w:lang w:val="en-US"/>
-        </w:rPr>
-        <w:t xml:space="preserve"> }</w:t>
-      </w:r>
-      <w:proofErr w:type="gramEnd"/>
-      <w:r>
-        <w:rPr>
-          <w:b/>
-          <w:color w:val="0000FF"/>
-          <w:sz w:val="24"/>
-          <w:szCs w:val="24"/>
-          <w:lang w:val="en-US"/>
-        </w:rPr>
-        <w:t>}</w:t>
-      </w:r>
-    </w:p>
-    <w:p>
-      <w:pPr>
-        <w:shd w:val="clear" w:color="auto" w:fill="FFFFFF"/>
-        <w:ind w:firstLine="709"/>
-        <w:jc w:val="both"/>
-        <w:rPr>
-          <w:spacing w:val="-6"/>
-          <w:sz w:val="24"/>
-          <w:szCs w:val="24"/>
-        </w:rPr>
-      </w:pPr>
-      <w:r>
-        <w:rPr>
-          <w:spacing w:val="-6"/>
-          <w:sz w:val="24"/>
-          <w:szCs w:val="24"/>
-        </w:rPr>
-        <w:t>Разработчиком представлен комплект документов, включающий:</w:t>
-      </w:r>
-    </w:p>
-    <w:p>
-      <w:pPr>
-        <w:widowControl w:val="0"/>
-        <w:numPr>
-          <w:ilvl w:val="0"/>
-          <w:numId w:val="10"/>
-        </w:numPr>
-        <w:shd w:val="clear" w:color="auto" w:fill="FFFFFF"/>
-        <w:tabs>
-          <w:tab w:val="left" w:pos="938"/>
-        </w:tabs>
-        <w:suppressAutoHyphens/>
-        <w:autoSpaceDE w:val="0"/>
-        <w:spacing w:line="276" w:lineRule="auto"/>
-        <w:ind w:firstLine="709"/>
-        <w:jc w:val="both"/>
-        <w:rPr>
-          <w:spacing w:val="-6"/>
-          <w:sz w:val="24"/>
-          <w:szCs w:val="24"/>
-        </w:rPr>
-      </w:pPr>
-      <w:r>
-        <w:rPr>
-          <w:spacing w:val="-6"/>
-          <w:sz w:val="24"/>
-          <w:szCs w:val="24"/>
-        </w:rPr>
-        <w:t>перечень компетенций, которыми должен овладеть студент в результате освоения дисциплины;</w:t>
-      </w:r>
-    </w:p>
-    <w:p>
-      <w:pPr>
-        <w:widowControl w:val="0"/>
-        <w:numPr>
-          <w:ilvl w:val="0"/>
-          <w:numId w:val="10"/>
-        </w:numPr>
-        <w:shd w:val="clear" w:color="auto" w:fill="FFFFFF"/>
-        <w:tabs>
-          <w:tab w:val="left" w:pos="938"/>
-        </w:tabs>
-        <w:suppressAutoHyphens/>
-        <w:autoSpaceDE w:val="0"/>
-        <w:spacing w:line="276" w:lineRule="auto"/>
-        <w:ind w:firstLine="709"/>
-        <w:jc w:val="both"/>
-        <w:rPr>
-          <w:spacing w:val="-6"/>
-          <w:sz w:val="24"/>
-          <w:szCs w:val="24"/>
-        </w:rPr>
-      </w:pPr>
-      <w:r>
-        <w:rPr>
-          <w:spacing w:val="-6"/>
-          <w:sz w:val="24"/>
-          <w:szCs w:val="24"/>
-        </w:rPr>
-        <w:t>описание показателей и критериев оценивания компетенций, а также шкал оценивания;</w:t>
-      </w:r>
-    </w:p>
-    <w:p>
-      <w:pPr>
-        <w:widowControl w:val="0"/>
-        <w:numPr>
-          <w:ilvl w:val="0"/>
-          <w:numId w:val="10"/>
-        </w:numPr>
-        <w:shd w:val="clear" w:color="auto" w:fill="FFFFFF"/>
-        <w:tabs>
-          <w:tab w:val="left" w:pos="938"/>
-        </w:tabs>
-        <w:suppressAutoHyphens/>
-        <w:autoSpaceDE w:val="0"/>
-        <w:spacing w:line="276" w:lineRule="auto"/>
-        <w:ind w:right="12" w:firstLine="709"/>
-        <w:jc w:val="both"/>
-        <w:rPr>
-          <w:spacing w:val="-6"/>
-          <w:sz w:val="24"/>
-          <w:szCs w:val="24"/>
-        </w:rPr>
-      </w:pPr>
-      <w:r>
-        <w:rPr>
-          <w:spacing w:val="-6"/>
-          <w:sz w:val="24"/>
-          <w:szCs w:val="24"/>
-        </w:rPr>
-        <w:t>типовые контрольные задания или иные материалы, необходимые для оценки результатов освоения дисциплины</w:t>
-      </w:r>
-      <w:r>
-        <w:rPr>
-          <w:spacing w:val="-6"/>
-          <w:sz w:val="24"/>
-          <w:szCs w:val="24"/>
-        </w:rPr>
-        <w:t xml:space="preserve">, </w:t>
-      </w:r>
-      <w:r>
-        <w:rPr>
-          <w:sz w:val="24"/>
-          <w:szCs w:val="24"/>
-        </w:rPr>
-        <w:t>с учетом практической подготовки обучающихся</w:t>
-      </w:r>
-      <w:r>
-        <w:rPr>
-          <w:sz w:val="24"/>
-          <w:szCs w:val="24"/>
-        </w:rPr>
-        <w:t>.</w:t>
-      </w:r>
-    </w:p>
-    <w:p>
-      <w:pPr>
-        <w:widowControl w:val="0"/>
-        <w:shd w:val="clear" w:color="auto" w:fill="FFFFFF"/>
-        <w:tabs>
-          <w:tab w:val="left" w:pos="938"/>
-        </w:tabs>
-        <w:suppressAutoHyphens/>
-        <w:autoSpaceDE w:val="0"/>
-        <w:spacing w:line="276" w:lineRule="auto"/>
-        <w:ind w:right="12" w:firstLine="709"/>
-        <w:jc w:val="both"/>
-        <w:rPr>
-          <w:spacing w:val="-6"/>
-          <w:sz w:val="24"/>
-          <w:szCs w:val="24"/>
-        </w:rPr>
-      </w:pPr>
-      <w:r>
-        <w:rPr>
-          <w:spacing w:val="-6"/>
-          <w:sz w:val="24"/>
-          <w:szCs w:val="24"/>
-        </w:rPr>
-        <w:t xml:space="preserve">Рассмотрев представленные на </w:t>
-      </w:r>
-      <w:r>
-        <w:rPr>
-          <w:spacing w:val="-6"/>
-          <w:sz w:val="24"/>
-          <w:szCs w:val="24"/>
-        </w:rPr>
-        <w:t>рецензирование</w:t>
-      </w:r>
-      <w:r>
-        <w:rPr>
-          <w:spacing w:val="-6"/>
-          <w:sz w:val="24"/>
-          <w:szCs w:val="24"/>
-        </w:rPr>
-        <w:t xml:space="preserve"> материалы, </w:t>
-      </w:r>
-      <w:r>
-        <w:rPr>
-          <w:spacing w:val="-6"/>
-          <w:sz w:val="24"/>
-          <w:szCs w:val="24"/>
-        </w:rPr>
-        <w:t>рецензент</w:t>
-      </w:r>
-      <w:r>
-        <w:rPr>
-          <w:spacing w:val="-6"/>
-          <w:sz w:val="24"/>
-          <w:szCs w:val="24"/>
-        </w:rPr>
-        <w:t xml:space="preserve"> пришел к следующим</w:t>
-      </w:r>
-      <w:r>
-        <w:rPr>
-          <w:spacing w:val="-6"/>
-          <w:sz w:val="24"/>
-          <w:szCs w:val="24"/>
-        </w:rPr>
-        <w:t xml:space="preserve"> </w:t>
-      </w:r>
-      <w:r>
-        <w:rPr>
-          <w:spacing w:val="-6"/>
-          <w:sz w:val="24"/>
-          <w:szCs w:val="24"/>
-        </w:rPr>
-        <w:t>выводам:</w:t>
-      </w:r>
-    </w:p>
-    <w:p>
-      <w:pPr>
-        <w:shd w:val="clear" w:color="auto" w:fill="FFFFFF"/>
-        <w:ind w:right="10" w:firstLine="709"/>
-        <w:jc w:val="both"/>
-        <w:rPr>
-          <w:spacing w:val="-6"/>
-          <w:sz w:val="24"/>
-          <w:szCs w:val="24"/>
-        </w:rPr>
-      </w:pPr>
-      <w:r>
-        <w:rPr>
-          <w:spacing w:val="-6"/>
-          <w:sz w:val="24"/>
-          <w:szCs w:val="24"/>
-        </w:rPr>
-        <w:t>1. Структура и содержание ОМД для подготовки {{ degree_qualification_genitive }} соответствуют требованиям, предъявляемым к структуре, содержанию ОМД ОПОП ВО.</w:t>
-      </w:r>
-    </w:p>
-    <w:p>
-      <w:pPr>
-        <w:shd w:val="clear" w:color="auto" w:fill="FFFFFF"/>
-        <w:ind w:firstLine="709"/>
-        <w:jc w:val="both"/>
-        <w:rPr>
-          <w:sz w:val="24"/>
-          <w:szCs w:val="24"/>
-        </w:rPr>
-      </w:pPr>
-      <w:r>
-        <w:rPr>
-          <w:spacing w:val="-6"/>
-          <w:sz w:val="24"/>
-          <w:szCs w:val="24"/>
-        </w:rPr>
-        <w:t>А именно:</w:t>
-      </w:r>
-      <w:r>
-        <w:rPr>
-          <w:sz w:val="24"/>
-          <w:szCs w:val="24"/>
-        </w:rPr>
-        <w:t xml:space="preserve"> </w:t>
-      </w:r>
-    </w:p>
-    <w:p>
-      <w:pPr>
-        <w:numPr>
-          <w:ilvl w:val="0"/>
-          <w:numId w:val="8"/>
-        </w:numPr>
-        <w:shd w:val="clear" w:color="auto" w:fill="FFFFFF"/>
-        <w:ind w:left="1069"/>
-        <w:jc w:val="both"/>
-        <w:rPr>
-          <w:spacing w:val="-6"/>
-          <w:sz w:val="24"/>
-          <w:szCs w:val="24"/>
-        </w:rPr>
-      </w:pPr>
-      <w:r>
-        <w:rPr>
-          <w:sz w:val="24"/>
-          <w:szCs w:val="24"/>
-        </w:rPr>
-        <w:t xml:space="preserve">На </w:t>
-      </w:r>
-      <w:r>
-        <w:rPr>
-          <w:sz w:val="24"/>
-          <w:szCs w:val="24"/>
-        </w:rPr>
-        <w:t xml:space="preserve">учебных </w:t>
-      </w:r>
-      <w:r>
-        <w:rPr>
-          <w:sz w:val="24"/>
-          <w:szCs w:val="24"/>
-        </w:rPr>
-        <w:t xml:space="preserve">занятиях </w:t>
-      </w:r>
-      <w:r>
-        <w:rPr>
-          <w:sz w:val="24"/>
-          <w:szCs w:val="24"/>
-        </w:rPr>
-        <w:t>обучающиеся</w:t>
-      </w:r>
-      <w:r>
-        <w:rPr>
-          <w:sz w:val="24"/>
-          <w:szCs w:val="24"/>
-        </w:rPr>
-        <w:t xml:space="preserve"> выполняют </w:t>
-      </w:r>
-      <w:r>
-        <w:rPr>
-          <w:sz w:val="24"/>
-          <w:szCs w:val="24"/>
-        </w:rPr>
-        <w:t>запланированные настоящей программой отдельные виды учебных работ</w:t>
-      </w:r>
-      <w:r>
-        <w:rPr>
-          <w:sz w:val="24"/>
-          <w:szCs w:val="24"/>
-        </w:rPr>
-        <w:t>, в том числе отдельных элементов работ, связанных с будущей профессиональной деятельностью</w:t>
-      </w:r>
-    </w:p>
-    <w:p>
-      <w:pPr>
-        <w:widowControl w:val="0"/>
-        <w:numPr>
-          <w:ilvl w:val="0"/>
-          <w:numId w:val="8"/>
-        </w:numPr>
-        <w:shd w:val="clear" w:color="auto" w:fill="FFFFFF"/>
-        <w:tabs>
-          <w:tab w:val="left" w:pos="1339"/>
-        </w:tabs>
-        <w:suppressAutoHyphens/>
-        <w:autoSpaceDE w:val="0"/>
-        <w:spacing w:line="276" w:lineRule="auto"/>
-        <w:ind w:left="0" w:firstLine="709"/>
-        <w:jc w:val="both"/>
-        <w:rPr>
-          <w:spacing w:val="-6"/>
-          <w:sz w:val="24"/>
-          <w:szCs w:val="24"/>
-        </w:rPr>
-      </w:pPr>
-      <w:r>
-        <w:rPr>
-          <w:spacing w:val="-6"/>
-          <w:sz w:val="24"/>
-          <w:szCs w:val="24"/>
-        </w:rPr>
-        <w:t xml:space="preserve">Перечень </w:t>
-      </w:r>
-      <w:proofErr w:type="gramStart"/>
-      <w:r>
-        <w:rPr>
-          <w:spacing w:val="-6"/>
-          <w:sz w:val="24"/>
-          <w:szCs w:val="24"/>
-        </w:rPr>
-        <w:t>компетенций,  которыми</w:t>
-      </w:r>
-      <w:proofErr w:type="gramEnd"/>
-      <w:r>
-        <w:rPr>
-          <w:spacing w:val="-6"/>
-          <w:sz w:val="24"/>
-          <w:szCs w:val="24"/>
-        </w:rPr>
-        <w:t xml:space="preserve"> </w:t>
-      </w:r>
-      <w:proofErr w:type="gramStart"/>
-      <w:r>
-        <w:rPr>
-          <w:spacing w:val="-6"/>
-          <w:sz w:val="24"/>
-          <w:szCs w:val="24"/>
-        </w:rPr>
-        <w:t>должны  овладеть</w:t>
-      </w:r>
-      <w:proofErr w:type="gramEnd"/>
-      <w:r>
-        <w:rPr>
-          <w:spacing w:val="-6"/>
-          <w:sz w:val="24"/>
-          <w:szCs w:val="24"/>
-        </w:rPr>
-        <w:t xml:space="preserve"> студенты в результате     освоения </w:t>
-      </w:r>
-      <w:proofErr w:type="gramStart"/>
-      <w:r>
-        <w:rPr>
-          <w:spacing w:val="-6"/>
-          <w:sz w:val="24"/>
-          <w:szCs w:val="24"/>
-        </w:rPr>
-        <w:t>дисциплины</w:t>
-      </w:r>
-      <w:proofErr w:type="gramEnd"/>
-      <w:r>
-        <w:rPr>
-          <w:spacing w:val="-6"/>
-          <w:sz w:val="24"/>
-          <w:szCs w:val="24"/>
-        </w:rPr>
-        <w:t xml:space="preserve"> </w:t>
-      </w:r>
-      <w:proofErr w:type="gramStart"/>
-      <w:r>
-        <w:rPr>
-          <w:spacing w:val="-6"/>
-          <w:sz w:val="24"/>
-          <w:szCs w:val="24"/>
-        </w:rPr>
-        <w:t>соответствует  ФГОС</w:t>
-      </w:r>
-      <w:proofErr w:type="gramEnd"/>
-      <w:r>
-        <w:rPr>
-          <w:spacing w:val="-6"/>
-          <w:sz w:val="24"/>
-          <w:szCs w:val="24"/>
-        </w:rPr>
-        <w:t xml:space="preserve"> ВО</w:t>
-      </w:r>
-    </w:p>
-    <w:p>
-      <w:pPr>
-        <w:widowControl w:val="0"/>
-        <w:numPr>
-          <w:ilvl w:val="0"/>
-          <w:numId w:val="8"/>
-        </w:numPr>
-        <w:shd w:val="clear" w:color="auto" w:fill="FFFFFF"/>
-        <w:tabs>
-          <w:tab w:val="left" w:pos="1339"/>
-        </w:tabs>
-        <w:suppressAutoHyphens/>
-        <w:autoSpaceDE w:val="0"/>
-        <w:spacing w:line="276" w:lineRule="auto"/>
-        <w:ind w:left="0" w:firstLine="709"/>
-        <w:jc w:val="both"/>
-        <w:rPr>
-          <w:spacing w:val="-6"/>
-          <w:sz w:val="24"/>
-          <w:szCs w:val="24"/>
-        </w:rPr>
-      </w:pPr>
-      <w:r>
-        <w:rPr>
-          <w:spacing w:val="-6"/>
-          <w:sz w:val="24"/>
-          <w:szCs w:val="24"/>
-        </w:rPr>
-        <w:t>Показатели и критерии оценивания компетенций, а также шкалы оценивания обеспечивают возможность проведения всесторонней оценки результатов обучения</w:t>
-      </w:r>
-    </w:p>
-    <w:p>
-      <w:pPr>
-        <w:widowControl w:val="0"/>
-        <w:numPr>
-          <w:ilvl w:val="0"/>
-          <w:numId w:val="8"/>
-        </w:numPr>
-        <w:shd w:val="clear" w:color="auto" w:fill="FFFFFF"/>
-        <w:tabs>
-          <w:tab w:val="left" w:pos="1339"/>
-        </w:tabs>
-        <w:suppressAutoHyphens/>
-        <w:autoSpaceDE w:val="0"/>
-        <w:spacing w:line="276" w:lineRule="auto"/>
-        <w:ind w:left="0" w:firstLine="709"/>
-        <w:jc w:val="both"/>
-        <w:rPr>
-          <w:spacing w:val="-6"/>
-          <w:sz w:val="24"/>
-          <w:szCs w:val="24"/>
-        </w:rPr>
-      </w:pPr>
-      <w:r>
-        <w:rPr>
-          <w:spacing w:val="-6"/>
-          <w:sz w:val="24"/>
-          <w:szCs w:val="24"/>
-        </w:rPr>
-        <w:t xml:space="preserve">Контрольные задания и иные материалы оценки результатов освоения дисциплины разработаны на основе принципов оценивания: определённости, однозначности, надёжности; </w:t>
-      </w:r>
-      <w:proofErr w:type="gramStart"/>
-      <w:r>
-        <w:rPr>
-          <w:spacing w:val="-6"/>
-          <w:sz w:val="24"/>
-          <w:szCs w:val="24"/>
-        </w:rPr>
-        <w:t>соответству</w:t>
-      </w:r>
-      <w:r>
-        <w:rPr>
-          <w:spacing w:val="-6"/>
-          <w:sz w:val="24"/>
-          <w:szCs w:val="24"/>
-        </w:rPr>
-        <w:t>ю</w:t>
-      </w:r>
-      <w:r>
-        <w:rPr>
-          <w:spacing w:val="-6"/>
-          <w:sz w:val="24"/>
-          <w:szCs w:val="24"/>
-        </w:rPr>
-        <w:t>т  требованиям</w:t>
-      </w:r>
-      <w:proofErr w:type="gramEnd"/>
-      <w:r>
-        <w:rPr>
-          <w:spacing w:val="-6"/>
-          <w:sz w:val="24"/>
-          <w:szCs w:val="24"/>
-        </w:rPr>
-        <w:t xml:space="preserve"> к составу и взаимосвязи оценочных средств, полноте по количественному составу оценочных </w:t>
-      </w:r>
-      <w:r>
-        <w:rPr>
-          <w:spacing w:val="-6"/>
-          <w:sz w:val="24"/>
-          <w:szCs w:val="24"/>
-        </w:rPr>
-        <w:t>материалов</w:t>
-      </w:r>
-      <w:r>
-        <w:rPr>
-          <w:spacing w:val="-6"/>
-          <w:sz w:val="24"/>
-          <w:szCs w:val="24"/>
-        </w:rPr>
-        <w:t xml:space="preserve"> и позволяют объектив</w:t>
-      </w:r>
-      <w:r>
-        <w:rPr>
-          <w:spacing w:val="-6"/>
-          <w:sz w:val="24"/>
-          <w:szCs w:val="24"/>
-        </w:rPr>
-        <w:t>но оценить результаты обучения</w:t>
-      </w:r>
-      <w:r>
-        <w:rPr>
-          <w:spacing w:val="-6"/>
-          <w:sz w:val="24"/>
-          <w:szCs w:val="24"/>
-        </w:rPr>
-        <w:t>,</w:t>
-      </w:r>
-      <w:r>
-        <w:rPr>
-          <w:spacing w:val="-6"/>
-          <w:sz w:val="24"/>
-          <w:szCs w:val="24"/>
-        </w:rPr>
-        <w:t xml:space="preserve"> </w:t>
-      </w:r>
-      <w:r>
-        <w:rPr>
-          <w:sz w:val="24"/>
-          <w:szCs w:val="24"/>
-        </w:rPr>
-        <w:t>направленные на практическую подготовку обучающихся</w:t>
-      </w:r>
-      <w:r>
-        <w:rPr>
-          <w:sz w:val="24"/>
-          <w:szCs w:val="24"/>
-        </w:rPr>
-        <w:t>.</w:t>
-      </w:r>
-    </w:p>
-    <w:p>
-      <w:pPr>
-        <w:shd w:val="clear" w:color="auto" w:fill="FFFFFF"/>
-        <w:tabs>
-          <w:tab w:val="left" w:pos="1082"/>
-          <w:tab w:val="left" w:leader="underscore" w:pos="2585"/>
-          <w:tab w:val="left" w:leader="underscore" w:pos="5345"/>
-        </w:tabs>
-        <w:ind w:firstLine="709"/>
-        <w:jc w:val="both"/>
-        <w:rPr>
-          <w:b/>
-          <w:bCs/>
-          <w:spacing w:val="-6"/>
-          <w:sz w:val="24"/>
-          <w:szCs w:val="24"/>
-        </w:rPr>
-      </w:pPr>
-      <w:r>
-        <w:rPr>
-          <w:b/>
-          <w:bCs/>
-          <w:spacing w:val="-6"/>
-          <w:sz w:val="24"/>
-          <w:szCs w:val="24"/>
-        </w:rPr>
-        <w:t>2</w:t>
-      </w:r>
-      <w:r>
-        <w:rPr>
-          <w:b/>
-          <w:bCs/>
-          <w:spacing w:val="-6"/>
-          <w:sz w:val="24"/>
-          <w:szCs w:val="24"/>
-        </w:rPr>
-        <w:tab/>
-        <w:t xml:space="preserve">Направленность </w:t>
-      </w:r>
-      <w:r>
-        <w:rPr>
-          <w:b/>
-          <w:bCs/>
-          <w:spacing w:val="-6"/>
-          <w:sz w:val="24"/>
-          <w:szCs w:val="24"/>
-        </w:rPr>
-        <w:t>ОМД</w:t>
-      </w:r>
-      <w:r>
-        <w:rPr>
-          <w:b/>
-          <w:bCs/>
-          <w:spacing w:val="-6"/>
-          <w:sz w:val="24"/>
-          <w:szCs w:val="24"/>
-        </w:rPr>
-        <w:t xml:space="preserve"> по дисциплине </w:t>
-      </w:r>
-      <w:proofErr w:type="gramStart"/>
-      <w:r>
-        <w:rPr>
-          <w:b/>
-          <w:sz w:val="24"/>
-          <w:szCs w:val="24"/>
-        </w:rPr>
-        <w:t xml:space="preserve">{{ </w:t>
-      </w:r>
-      <w:proofErr w:type="spellStart"/>
-      <w:r>
-        <w:rPr>
-          <w:b/>
-          <w:sz w:val="24"/>
-          <w:szCs w:val="24"/>
-        </w:rPr>
-        <w:t>course</w:t>
-      </w:r>
-      <w:proofErr w:type="gramEnd"/>
-      <w:r>
-        <w:rPr>
-          <w:b/>
-          <w:sz w:val="24"/>
-          <w:szCs w:val="24"/>
-        </w:rPr>
-        <w:t>_</w:t>
-      </w:r>
-      <w:proofErr w:type="gramStart"/>
-      <w:r>
-        <w:rPr>
-          <w:b/>
-          <w:sz w:val="24"/>
-          <w:szCs w:val="24"/>
-        </w:rPr>
-        <w:t>title</w:t>
-      </w:r>
-      <w:proofErr w:type="spellEnd"/>
-      <w:r>
-        <w:rPr>
-          <w:b/>
-          <w:sz w:val="24"/>
-          <w:szCs w:val="24"/>
-        </w:rPr>
-        <w:t xml:space="preserve"> }</w:t>
-      </w:r>
-      <w:proofErr w:type="gramEnd"/>
-      <w:r>
-        <w:rPr>
-          <w:b/>
-          <w:sz w:val="24"/>
-          <w:szCs w:val="24"/>
-        </w:rPr>
-        <w:t>}</w:t>
-      </w:r>
-      <w:r>
-        <w:rPr>
-          <w:b/>
-          <w:sz w:val="24"/>
-          <w:szCs w:val="24"/>
-        </w:rPr>
-        <w:t xml:space="preserve"> </w:t>
-      </w:r>
-      <w:r>
-        <w:rPr>
-          <w:spacing w:val="-6"/>
-          <w:sz w:val="24"/>
-          <w:szCs w:val="24"/>
-        </w:rPr>
-        <w:t xml:space="preserve">соответствует целям ОПОП ВО по направлению </w:t>
-      </w:r>
-      <w:proofErr w:type="gramStart"/>
-      <w:r>
-        <w:rPr>
-          <w:b/>
-          <w:sz w:val="24"/>
-          <w:szCs w:val="24"/>
-        </w:rPr>
-        <w:t xml:space="preserve">{{ </w:t>
-      </w:r>
-      <w:proofErr w:type="spellStart"/>
-      <w:r>
-        <w:rPr>
-          <w:b/>
-          <w:sz w:val="24"/>
-          <w:szCs w:val="24"/>
-        </w:rPr>
-        <w:t>major</w:t>
-      </w:r>
-      <w:proofErr w:type="gramEnd"/>
-      <w:r>
-        <w:rPr>
-          <w:b/>
-          <w:sz w:val="24"/>
-          <w:szCs w:val="24"/>
-        </w:rPr>
-        <w:t>_</w:t>
-      </w:r>
-      <w:proofErr w:type="gramStart"/>
-      <w:r>
-        <w:rPr>
-          <w:b/>
-          <w:sz w:val="24"/>
-          <w:szCs w:val="24"/>
-        </w:rPr>
-        <w:t>code</w:t>
-      </w:r>
-      <w:proofErr w:type="spellEnd"/>
-      <w:r>
-        <w:rPr>
-          <w:b/>
-          <w:sz w:val="24"/>
-          <w:szCs w:val="24"/>
-        </w:rPr>
-        <w:t xml:space="preserve"> }</w:t>
-      </w:r>
-      <w:proofErr w:type="gramEnd"/>
-      <w:r>
-        <w:rPr>
-          <w:b/>
-          <w:sz w:val="24"/>
-          <w:szCs w:val="24"/>
-        </w:rPr>
-        <w:t>}</w:t>
-      </w:r>
-      <w:r>
-        <w:rPr>
-          <w:b/>
-          <w:sz w:val="24"/>
-          <w:szCs w:val="24"/>
-        </w:rPr>
-        <w:t xml:space="preserve"> </w:t>
-      </w:r>
-      <w:proofErr w:type="gramStart"/>
-      <w:r>
-        <w:rPr>
-          <w:b/>
-          <w:sz w:val="24"/>
-          <w:szCs w:val="24"/>
-        </w:rPr>
-        <w:t xml:space="preserve">{{ </w:t>
-      </w:r>
-      <w:proofErr w:type="spellStart"/>
-      <w:r>
-        <w:rPr>
-          <w:b/>
-          <w:sz w:val="24"/>
-          <w:szCs w:val="24"/>
-        </w:rPr>
-        <w:t>major</w:t>
-      </w:r>
-      <w:proofErr w:type="gramEnd"/>
-      <w:r>
-        <w:rPr>
-          <w:b/>
-          <w:sz w:val="24"/>
-          <w:szCs w:val="24"/>
-        </w:rPr>
-        <w:t>_</w:t>
-      </w:r>
-      <w:proofErr w:type="gramStart"/>
-      <w:r>
-        <w:rPr>
-          <w:b/>
-          <w:sz w:val="24"/>
-          <w:szCs w:val="24"/>
-        </w:rPr>
-        <w:t>title</w:t>
-      </w:r>
-      <w:proofErr w:type="spellEnd"/>
-      <w:r>
-        <w:rPr>
-          <w:b/>
-          <w:sz w:val="24"/>
-          <w:szCs w:val="24"/>
-        </w:rPr>
-        <w:t xml:space="preserve"> }</w:t>
-      </w:r>
-      <w:proofErr w:type="gramEnd"/>
-      <w:r>
-        <w:rPr>
-          <w:b/>
-          <w:sz w:val="24"/>
-          <w:szCs w:val="24"/>
-        </w:rPr>
-        <w:t>}</w:t>
-      </w:r>
-      <w:proofErr w:type="gramStart"/>
-      <w:r>
-        <w:rPr>
-          <w:b/>
-          <w:sz w:val="24"/>
-          <w:szCs w:val="24"/>
-        </w:rPr>
-        <w:t xml:space="preserve">,  </w:t>
-      </w:r>
-      <w:r>
-        <w:rPr>
-          <w:spacing w:val="-6"/>
-          <w:sz w:val="24"/>
-          <w:szCs w:val="24"/>
-        </w:rPr>
-        <w:t>профессиональным</w:t>
-      </w:r>
-      <w:proofErr w:type="gramEnd"/>
-      <w:r>
-        <w:rPr>
-          <w:spacing w:val="-6"/>
-          <w:sz w:val="24"/>
-          <w:szCs w:val="24"/>
-        </w:rPr>
-        <w:t xml:space="preserve"> стандартам будущей профессиональной деятельности студента.</w:t>
-      </w:r>
-    </w:p>
-    <w:p>
-      <w:pPr>
-        <w:widowControl w:val="0"/>
-        <w:numPr>
-          <w:ilvl w:val="0"/>
-          <w:numId w:val="9"/>
-        </w:numPr>
-        <w:shd w:val="clear" w:color="auto" w:fill="FFFFFF"/>
-        <w:tabs>
-          <w:tab w:val="left" w:pos="1082"/>
-        </w:tabs>
-        <w:suppressAutoHyphens/>
-        <w:autoSpaceDE w:val="0"/>
-        <w:spacing w:line="276" w:lineRule="auto"/>
-        <w:ind w:firstLine="709"/>
-        <w:jc w:val="both"/>
-        <w:rPr>
-          <w:spacing w:val="-6"/>
-          <w:sz w:val="24"/>
-          <w:szCs w:val="24"/>
-        </w:rPr>
-      </w:pPr>
-      <w:r>
-        <w:rPr>
-          <w:b/>
-          <w:bCs/>
-          <w:spacing w:val="-6"/>
-          <w:sz w:val="24"/>
-          <w:szCs w:val="24"/>
-        </w:rPr>
-        <w:t xml:space="preserve">Объём </w:t>
-      </w:r>
-      <w:r>
-        <w:rPr>
-          <w:b/>
-          <w:bCs/>
-          <w:spacing w:val="-6"/>
-          <w:sz w:val="24"/>
-          <w:szCs w:val="24"/>
-        </w:rPr>
-        <w:t>ОМД</w:t>
-      </w:r>
-      <w:r>
-        <w:rPr>
-          <w:b/>
-          <w:bCs/>
-          <w:spacing w:val="-6"/>
-          <w:sz w:val="24"/>
-          <w:szCs w:val="24"/>
-        </w:rPr>
-        <w:t xml:space="preserve"> </w:t>
-      </w:r>
-      <w:r>
-        <w:rPr>
-          <w:spacing w:val="-6"/>
-          <w:sz w:val="24"/>
-          <w:szCs w:val="24"/>
-        </w:rPr>
-        <w:t>соответствует учебному плану подготовки.</w:t>
-      </w:r>
-    </w:p>
-    <w:p>
-      <w:pPr>
-        <w:widowControl w:val="0"/>
-        <w:numPr>
-          <w:ilvl w:val="0"/>
-          <w:numId w:val="9"/>
-        </w:numPr>
-        <w:shd w:val="clear" w:color="auto" w:fill="FFFFFF"/>
-        <w:tabs>
-          <w:tab w:val="left" w:pos="1082"/>
-        </w:tabs>
-        <w:suppressAutoHyphens/>
-        <w:autoSpaceDE w:val="0"/>
-        <w:spacing w:line="276" w:lineRule="auto"/>
-        <w:ind w:firstLine="709"/>
-        <w:jc w:val="both"/>
-        <w:rPr>
-          <w:spacing w:val="-6"/>
-          <w:sz w:val="24"/>
-          <w:szCs w:val="24"/>
-        </w:rPr>
-      </w:pPr>
-      <w:r>
-        <w:rPr>
-          <w:spacing w:val="-6"/>
-          <w:sz w:val="24"/>
-          <w:szCs w:val="24"/>
-        </w:rPr>
-        <w:t xml:space="preserve">По качеству </w:t>
-      </w:r>
-      <w:r>
-        <w:rPr>
-          <w:spacing w:val="-6"/>
-          <w:sz w:val="24"/>
-          <w:szCs w:val="24"/>
-        </w:rPr>
-        <w:t>ОМД</w:t>
-      </w:r>
-      <w:r>
-        <w:rPr>
-          <w:spacing w:val="-6"/>
-          <w:sz w:val="24"/>
-          <w:szCs w:val="24"/>
-        </w:rPr>
-        <w:t xml:space="preserve"> в целом обеспечивают объективность и достоверность результатов при проведении оценивания с различными целями.</w:t>
-      </w:r>
-    </w:p>
-    <w:p>
-      <w:pPr>
-        <w:shd w:val="clear" w:color="auto" w:fill="FFFFFF"/>
-        <w:ind w:firstLine="709"/>
-        <w:jc w:val="both"/>
-        <w:rPr>
-          <w:spacing w:val="-6"/>
-          <w:sz w:val="24"/>
-          <w:szCs w:val="24"/>
-        </w:rPr>
-      </w:pPr>
-      <w:r>
-        <w:rPr>
-          <w:spacing w:val="-6"/>
-          <w:sz w:val="24"/>
-          <w:szCs w:val="24"/>
-        </w:rPr>
-        <w:t xml:space="preserve">для подготовки </w:t>
-      </w:r>
-      <w:proofErr w:type="gramStart"/>
-      <w:r>
-        <w:rPr>
-          <w:spacing w:val="-6"/>
-          <w:sz w:val="24"/>
-          <w:szCs w:val="24"/>
-        </w:rPr>
-        <w:t>{{ degree</w:t>
-      </w:r>
-      <w:proofErr w:type="gramEnd"/>
-      <w:r>
-        <w:rPr>
-          <w:spacing w:val="-6"/>
-          <w:sz w:val="24"/>
-          <w:szCs w:val="24"/>
-        </w:rPr>
-        <w:t>_</w:t>
-      </w:r>
-      <w:proofErr w:type="gramStart"/>
-      <w:r>
-        <w:rPr>
-          <w:spacing w:val="-6"/>
-          <w:sz w:val="24"/>
-          <w:szCs w:val="24"/>
-        </w:rPr>
-        <w:t>type }</w:t>
-      </w:r>
-      <w:proofErr w:type="gramEnd"/>
-      <w:r>
-        <w:rPr>
-          <w:spacing w:val="-6"/>
-          <w:sz w:val="24"/>
-          <w:szCs w:val="24"/>
-        </w:rPr>
-        <w:t>}</w:t>
-      </w:r>
-    </w:p>
-    <w:p>
-      <w:pPr>
-        <w:shd w:val="clear" w:color="auto" w:fill="FFFFFF"/>
-        <w:jc w:val="both"/>
-        <w:rPr>
-          <w:b/>
-          <w:bCs/>
-          <w:spacing w:val="-6"/>
-          <w:sz w:val="24"/>
-          <w:szCs w:val="24"/>
-        </w:rPr>
-      </w:pPr>
-    </w:p>
-    <w:p>
-      <w:pPr>
-        <w:shd w:val="clear" w:color="auto" w:fill="FFFFFF"/>
-        <w:ind w:firstLine="709"/>
-        <w:jc w:val="center"/>
-        <w:rPr>
-          <w:b/>
-          <w:bCs/>
-          <w:spacing w:val="-6"/>
-          <w:sz w:val="24"/>
-          <w:szCs w:val="24"/>
-        </w:rPr>
-      </w:pPr>
-    </w:p>
-    <w:p>
-      <w:pPr>
-        <w:shd w:val="clear" w:color="auto" w:fill="FFFFFF"/>
-        <w:ind w:firstLine="709"/>
-        <w:jc w:val="center"/>
-        <w:rPr>
-          <w:spacing w:val="-6"/>
-          <w:sz w:val="24"/>
-          <w:szCs w:val="24"/>
-        </w:rPr>
-      </w:pPr>
-      <w:r>
-        <w:rPr>
-          <w:b/>
-          <w:bCs/>
-          <w:spacing w:val="-6"/>
-          <w:sz w:val="24"/>
-          <w:szCs w:val="24"/>
-        </w:rPr>
-        <w:t>ОБЩИЕ ВЫВОДЫ</w:t>
-      </w:r>
-    </w:p>
-    <w:p>
-      <w:pPr>
-        <w:shd w:val="clear" w:color="auto" w:fill="FFFFFF"/>
-        <w:tabs>
-          <w:tab w:val="left" w:leader="dot" w:pos="7745"/>
-        </w:tabs>
-        <w:ind w:firstLine="709"/>
-        <w:jc w:val="both"/>
-        <w:rPr>
-          <w:spacing w:val="-6"/>
-          <w:sz w:val="24"/>
-          <w:szCs w:val="24"/>
-        </w:rPr>
-      </w:pPr>
-      <w:r>
-        <w:rPr>
-          <w:spacing w:val="-6"/>
-          <w:sz w:val="24"/>
-          <w:szCs w:val="24"/>
-        </w:rPr>
-        <w:t>для подготовки {{ degree_type }}</w:t>
-      </w:r>
-    </w:p>
-    <w:p>
-      <w:pPr>
-        <w:pStyle w:val="a9"/>
-        <w:ind w:left="1200" w:right="-2" w:hanging="1200"/>
-        <w:rPr>
-          <w:rFonts w:ascii="Times New Roman" w:hAnsi="Times New Roman"/>
-          <w:color w:val="0070C0"/>
-          <w:sz w:val="24"/>
-          <w:szCs w:val="24"/>
-        </w:rPr>
       </w:pPr>
       <w:r>
         <w:rPr>
           <w:rFonts w:ascii="Times New Roman" w:hAnsi="Times New Roman"/>
           <w:sz w:val="24"/>
-          <w:szCs w:val="24"/>
-        </w:rPr>
-        <w:t xml:space="preserve">Рецензент: {{ reviewer }}       </w:t>
-      </w:r>
-    </w:p>
-    <w:p>
-      <w:pPr>
-        <w:pStyle w:val="a9"/>
-        <w:ind w:left="2832" w:right="-2" w:firstLine="708"/>
+        </w:rPr>
+        <w:t>{{ reviewer_full_intro }}, проведена экспертиза оценочных материалов дисциплины (ОМД) «{{ course_title }}» для подготовки {{ degree_type }} по направлению {{ major_code }} «{{ major_title }}», направленность «{{ profile_title }}», разработанных {{ developers_intro }}.</w:t>
+      </w:r>
+    </w:p>
+    <w:p>
+      <w:pPr>
+        <w:spacing w:line="276" w:lineRule="auto"/>
+        <w:ind w:firstLine="708"/>
+        <w:jc w:val="both"/>
+      </w:pPr>
+      <w:r>
         <w:rPr>
           <w:rFonts w:ascii="Times New Roman" w:hAnsi="Times New Roman"/>
           <w:sz w:val="24"/>
-          <w:szCs w:val="24"/>
-          <w:vertAlign w:val="superscript"/>
-        </w:rPr>
+        </w:rPr>
+        <w:t>Разработчиком представлен комплект документов, включающий:</w:t>
+      </w:r>
+    </w:p>
+    <w:p>
+      <w:pPr>
+        <w:spacing w:line="276" w:lineRule="auto"/>
+        <w:ind w:firstLine="708"/>
+        <w:jc w:val="both"/>
       </w:pPr>
       <w:r>
         <w:rPr>
           <w:rFonts w:ascii="Times New Roman" w:hAnsi="Times New Roman"/>
           <w:sz w:val="24"/>
-          <w:szCs w:val="24"/>
-          <w:vertAlign w:val="superscript"/>
-        </w:rPr>
-        <w:t xml:space="preserve">                   (подпись)</w:t>
-      </w:r>
-    </w:p>
-    <w:p>
-      <w:pPr>
-        <w:shd w:val="clear" w:color="auto" w:fill="FFFFFF"/>
-        <w:tabs>
-          <w:tab w:val="left" w:pos="4046"/>
-          <w:tab w:val="left" w:leader="underscore" w:pos="4481"/>
-        </w:tabs>
-        <w:ind w:right="4493"/>
-        <w:rPr>
-          <w:color w:val="0000FF"/>
-          <w:spacing w:val="-6"/>
+        </w:rPr>
+        <w:t>• перечень компетенций, которыми должен овладеть студент в результате освоения дисциплины;</w:t>
+      </w:r>
+    </w:p>
+    <w:p>
+      <w:pPr>
+        <w:spacing w:line="276" w:lineRule="auto"/>
+        <w:ind w:firstLine="708"/>
+        <w:jc w:val="both"/>
+      </w:pPr>
+      <w:r>
+        <w:rPr>
+          <w:rFonts w:ascii="Times New Roman" w:hAnsi="Times New Roman"/>
           <w:sz w:val="24"/>
-          <w:szCs w:val="24"/>
-        </w:rPr>
-      </w:pPr>
-      <w:r>
-        <w:rPr>
-          <w:spacing w:val="-6"/>
+        </w:rPr>
+        <w:t>• описание показателей и критериев оценивания компетенций, а также шкал оценивания;</w:t>
+      </w:r>
+    </w:p>
+    <w:p>
+      <w:pPr>
+        <w:spacing w:line="276" w:lineRule="auto"/>
+        <w:ind w:firstLine="708"/>
+        <w:jc w:val="both"/>
+      </w:pPr>
+      <w:r>
+        <w:rPr>
+          <w:rFonts w:ascii="Times New Roman" w:hAnsi="Times New Roman"/>
           <w:sz w:val="24"/>
-          <w:szCs w:val="24"/>
-        </w:rPr>
-        <w:t>Рецензия рассмотрена</w:t>
-      </w:r>
-      <w:r>
-        <w:rPr>
-          <w:spacing w:val="-6"/>
+        </w:rPr>
+        <w:t>• типовые контрольные задания или иные материалы, необходимые для оценки результатов освоения дисциплины с учетом практической подготовки обучающихся.</w:t>
+      </w:r>
+    </w:p>
+    <w:p>
+      <w:pPr>
+        <w:spacing w:line="276" w:lineRule="auto" w:before="120"/>
+        <w:ind w:firstLine="708"/>
+        <w:jc w:val="both"/>
+      </w:pPr>
+      <w:r>
+        <w:rPr>
+          <w:rFonts w:ascii="Times New Roman" w:hAnsi="Times New Roman"/>
           <w:sz w:val="24"/>
-          <w:szCs w:val="24"/>
-        </w:rPr>
-        <w:t xml:space="preserve"> </w:t>
-      </w:r>
-      <w:r>
-        <w:rPr>
-          <w:color w:val="0000FF"/>
-          <w:spacing w:val="-6"/>
+        </w:rPr>
+        <w:t>Рассмотрев представленные на экспертизу материалы, эксперт пришел к следующим выводам:</w:t>
+      </w:r>
+    </w:p>
+    <w:p>
+      <w:pPr>
+        <w:spacing w:line="276" w:lineRule="auto"/>
+        <w:ind w:firstLine="708"/>
+        <w:jc w:val="both"/>
+      </w:pPr>
+      <w:r>
+        <w:rPr>
+          <w:rFonts w:ascii="Times New Roman" w:hAnsi="Times New Roman"/>
           <w:sz w:val="24"/>
-          <w:szCs w:val="24"/>
-        </w:rPr>
-        <w:t xml:space="preserve">на заседании кафедры </w:t>
-      </w:r>
-    </w:p>
-    <w:p>
-      <w:pPr>
-        <w:shd w:val="clear" w:color="auto" w:fill="FFFFFF"/>
-        <w:tabs>
-          <w:tab w:val="left" w:pos="4046"/>
-          <w:tab w:val="left" w:leader="underscore" w:pos="4481"/>
-        </w:tabs>
-        <w:ind w:right="4493"/>
-        <w:rPr>
-          <w:color w:val="0000FF"/>
-          <w:spacing w:val="-6"/>
+        </w:rPr>
+        <w:t>1. Структура и содержание ОМД для подготовки {{ degree_qualification_genitive }} соответствуют требованиям, предъявляемым к структуре и содержанию оценочных материалов дисциплин ОПОП ВО.</w:t>
+      </w:r>
+    </w:p>
+    <w:p>
+      <w:pPr>
+        <w:spacing w:line="276" w:lineRule="auto"/>
+        <w:ind w:firstLine="708"/>
+        <w:jc w:val="both"/>
+      </w:pPr>
+      <w:r>
+        <w:rPr>
+          <w:rFonts w:ascii="Times New Roman" w:hAnsi="Times New Roman"/>
           <w:sz w:val="24"/>
-          <w:szCs w:val="24"/>
-        </w:rPr>
-      </w:pPr>
-      <w:proofErr w:type="gramStart"/>
-      <w:r>
-        <w:rPr>
-          <w:color w:val="0000FF"/>
-          <w:spacing w:val="-6"/>
+        </w:rPr>
+        <w:t>• Перечень компетенций, которыми должны овладеть студенты в результате освоения дисциплины, полностью соответствует ФГОС ВО.</w:t>
+      </w:r>
+    </w:p>
+    <w:p>
+      <w:pPr>
+        <w:spacing w:line="276" w:lineRule="auto"/>
+        <w:ind w:firstLine="708"/>
+        <w:jc w:val="both"/>
+      </w:pPr>
+      <w:r>
+        <w:rPr>
+          <w:rFonts w:ascii="Times New Roman" w:hAnsi="Times New Roman"/>
           <w:sz w:val="24"/>
-          <w:szCs w:val="24"/>
-        </w:rPr>
-        <w:t xml:space="preserve">{{ </w:t>
-      </w:r>
-      <w:proofErr w:type="spellStart"/>
-      <w:r>
-        <w:rPr>
-          <w:color w:val="0000FF"/>
-          <w:spacing w:val="-6"/>
+        </w:rPr>
+        <w:t>• Показатели и критерии оценивания компетенций, а также шкалы оценивания обеспечивают возможность всесторонней объективной оценки результатов обучения.</w:t>
+      </w:r>
+    </w:p>
+    <w:p>
+      <w:pPr>
+        <w:spacing w:line="276" w:lineRule="auto"/>
+        <w:ind w:firstLine="708"/>
+        <w:jc w:val="both"/>
+      </w:pPr>
+      <w:r>
+        <w:rPr>
+          <w:rFonts w:ascii="Times New Roman" w:hAnsi="Times New Roman"/>
           <w:sz w:val="24"/>
-          <w:szCs w:val="24"/>
-        </w:rPr>
-        <w:t>department</w:t>
-      </w:r>
-      <w:proofErr w:type="spellEnd"/>
-      <w:proofErr w:type="gramEnd"/>
-      <w:r>
-        <w:rPr>
-          <w:color w:val="0000FF"/>
-          <w:spacing w:val="-6"/>
+        </w:rPr>
+        <w:t>• Контрольные задания и оценочные средства разработаны на основе принципов академической определенности, однозначности и надежности; соответствуют требованиям к составу и полноте оценочных материалов и позволяют объективно оценить практическую подготовку обучающихся.</w:t>
+      </w:r>
+    </w:p>
+    <w:p>
+      <w:pPr>
+        <w:spacing w:line="276" w:lineRule="auto" w:before="120"/>
+        <w:ind w:firstLine="708"/>
+        <w:jc w:val="both"/>
+      </w:pPr>
+      <w:r>
+        <w:rPr>
+          <w:rFonts w:ascii="Times New Roman" w:hAnsi="Times New Roman"/>
           <w:sz w:val="24"/>
-          <w:szCs w:val="24"/>
-        </w:rPr>
-        <w:t xml:space="preserve"> }} </w:t>
-      </w:r>
-    </w:p>
-    <w:p>
-      <w:pPr>
-        <w:ind w:firstLine="709"/>
+        </w:rPr>
+        <w:t>2. Направленность ОМД по дисциплине «{{ course_title }}» соответствует целям ОПОП ВО по направлению {{ major_code }} «{{ major_title }}», профессиональным стандартам и профилю будущей деятельности выпускника.</w:t>
+      </w:r>
+    </w:p>
+    <w:p>
+      <w:pPr>
+        <w:spacing w:line="276" w:lineRule="auto"/>
+        <w:ind w:firstLine="708"/>
+        <w:jc w:val="both"/>
+      </w:pPr>
+      <w:r>
+        <w:rPr>
+          <w:rFonts w:ascii="Times New Roman" w:hAnsi="Times New Roman"/>
+          <w:sz w:val="24"/>
+        </w:rPr>
+        <w:t>Объем оценочных материалов соответствует утвержденному учебному плану. По качеству ОМД в целом обеспечивают объективность и достоверность результатов контроля.</w:t>
+      </w:r>
+    </w:p>
+    <w:p>
+      <w:pPr>
+        <w:spacing w:before="240" w:after="120"/>
         <w:jc w:val="center"/>
-        <w:rPr>
+      </w:pPr>
+      <w:r>
+        <w:rPr>
+          <w:rFonts w:ascii="Times New Roman" w:hAnsi="Times New Roman"/>
           <w:b/>
           <w:sz w:val="24"/>
-          <w:szCs w:val="24"/>
-        </w:rPr>
-      </w:pPr>
-      <w:r>
-        <w:rPr>
-          <w:spacing w:val="-6"/>
+        </w:rPr>
+        <w:t>ОБЩИЕ ВЫВОДЫ</w:t>
+      </w:r>
+    </w:p>
+    <w:p>
+      <w:pPr>
+        <w:spacing w:line="276" w:lineRule="auto" w:after="240"/>
+        <w:ind w:firstLine="708"/>
+        <w:jc w:val="both"/>
+      </w:pPr>
+      <w:r>
+        <w:rPr>
+          <w:rFonts w:ascii="Times New Roman" w:hAnsi="Times New Roman"/>
           <w:sz w:val="24"/>
-          <w:szCs w:val="24"/>
-        </w:rPr>
-        <w:t xml:space="preserve">00.00.20__ Протокол №__          _______________            </w:t>
-      </w:r>
-      <w:r>
-        <w:rPr>
-          <w:spacing w:val="-6"/>
+        </w:rPr>
+        <w:t>На основании проведенной экспертизы можно сделать заключение, что оценочные материалы дисциплины (ОМД) «{{ course_title }}» для подготовки {{ degree_type }} по направлению {{ major_code }} «{{ major_title }}» (направленность «{{ profile_title }}»), разработанные {{ developers_intro }}, соответствуют требованиям образовательного стандарта, профессионального стандарта, современным требованиям рынка труда и позволят качественно оценивать уровень сформированности заявленных компетенций обучающихся.</w:t>
+      </w:r>
+    </w:p>
+    <w:p>
+      <w:pPr>
+        <w:spacing w:before="240" w:after="40"/>
+        <w:jc w:val="both"/>
+      </w:pPr>
+      <w:r>
+        <w:rPr>
+          <w:rFonts w:ascii="Times New Roman" w:hAnsi="Times New Roman"/>
           <w:sz w:val="24"/>
-          <w:szCs w:val="24"/>
-          <w:u w:val="single"/>
-        </w:rPr>
-        <w:t xml:space="preserve">Тихонова </w:t>
-      </w:r>
-      <w:proofErr w:type="gramStart"/>
-      <w:r>
-        <w:rPr>
-          <w:spacing w:val="-6"/>
+        </w:rPr>
+        <w:t>Рецензент: {{ reviewer }}</w:t>
+      </w:r>
+    </w:p>
+    <w:p>
+      <w:pPr>
+        <w:spacing w:after="320"/>
+        <w:jc w:val="right"/>
+      </w:pPr>
+      <w:r>
+        <w:rPr>
+          <w:rFonts w:ascii="Times New Roman" w:hAnsi="Times New Roman"/>
           <w:sz w:val="24"/>
-          <w:szCs w:val="24"/>
-          <w:u w:val="single"/>
-        </w:rPr>
-        <w:t>М.В.</w:t>
-      </w:r>
-      <w:proofErr w:type="gramEnd"/>
-    </w:p>
-    <w:p>
-      <w:pPr>
-        <w:widowControl w:val="0"/>
-        <w:rPr>
-          <w:b/>
+        </w:rPr>
+        <w:t>_____________________</w:t>
+      </w:r>
+    </w:p>
+    <w:p>
+      <w:pPr>
+        <w:spacing w:line="276" w:lineRule="auto"/>
+        <w:jc w:val="both"/>
+      </w:pPr>
+      <w:r>
+        <w:t>Рецензия рассмотрена и одобрена на заседании кафедры: {{ department }}</w:t>
+      </w:r>
+    </w:p>
+    <w:p>
+      <w:pPr>
+        <w:spacing w:line="276" w:lineRule="auto"/>
+        <w:jc w:val="both"/>
+      </w:pPr>
+      <w:r>
+        <w:t>«{{ protocol_day|default("___") }}» {{ protocol_month|default("_____________") }} {{ cathedra_meeting_year|default("202_") }} г. Протокол № {{ protocol_num|default("____") }}</w:t>
+      </w:r>
+    </w:p>
+    <w:p>
+      <w:pPr>
+        <w:spacing w:line="276" w:lineRule="auto" w:before="120"/>
+        <w:jc w:val="both"/>
+      </w:pPr>
+      <w:r>
+        <w:rPr>
+          <w:rFonts w:ascii="Times New Roman" w:hAnsi="Times New Roman"/>
           <w:sz w:val="24"/>
-          <w:szCs w:val="24"/>
-        </w:rPr>
-      </w:pPr>
-    </w:p>
-    <w:p>
-      <w:pPr>
-        <w:rPr>
-          <w:sz w:val="24"/>
-          <w:szCs w:val="24"/>
-        </w:rPr>
-      </w:pPr>
+        </w:rPr>
+        <w:t>Заведующий кафедрой                         _________________         {{ department_head_fio }}</w:t>
+      </w:r>
     </w:p>
     <w:sectPr>
       <w:headerReference w:type="default" r:id="rId10"/>

</xml_diff>